<commit_message>
Update paper.docx/tex for proposed BERT-BiLSTM and generate paper_bert_standalone.docx/tex with identical formatting, deleting deprecated files.
</commit_message>
<xml_diff>
--- a/paper/paper_bert_standalone.docx
+++ b/paper/paper_bert_standalone.docx
@@ -13,9 +13,11 @@
           <w:b/>
           <w:i w:val="0"/>
           <w:color w:val="000000"/>
-          <w:sz w:val="36"/>
+          <w:sz w:val="48"/>
         </w:rPr>
-        <w:t>Explainable and Context-Aware Fine-Tuning of Bidirectional Encoder Representations from Transformers for Online Recruitment Fraud Detection</w:t>
+        <w:t>Explainable and Context-Aware Fine-Tuning of Bidirectional Encoder</w:t>
+        <w:br/>
+        <w:t>Representations from Transformers for Online Recruitment Fraud Detection</w:t>
       </w:r>
     </w:p>
     <w:p>
@@ -29,7 +31,7 @@
           <w:b w:val="0"/>
           <w:i w:val="0"/>
           <w:color w:val="000000"/>
-          <w:sz w:val="20"/>
+          <w:sz w:val="22"/>
         </w:rPr>
         <w:t>Akhilesh Yadav</w:t>
         <w:br/>
@@ -37,24 +39,36 @@
         <w:br/>
         <w:t>M.Sc. (Data Science)</w:t>
         <w:br/>
+        <w:t>India</w:t>
+        <w:br/>
         <w:t>akhileshyadav8@gmail.com</w:t>
       </w:r>
     </w:p>
     <w:p>
       <w:pPr>
-        <w:spacing w:after="240"/>
-        <w:ind w:left="720" w:right="720"/>
+        <w:sectPr>
+          <w:pgSz w:w="12240" w:h="15840"/>
+          <w:pgMar w:top="1080" w:right="900" w:bottom="1440" w:left="900" w:header="720" w:footer="720" w:gutter="0"/>
+          <w:cols w:space="720"/>
+          <w:docGrid w:linePitch="360"/>
+        </w:sectPr>
+      </w:pPr>
+    </w:p>
+    <w:p>
+      <w:pPr>
+        <w:spacing w:after="120"/>
+        <w:ind w:firstLine="216"/>
         <w:jc w:val="both"/>
       </w:pPr>
       <w:r>
         <w:rPr>
           <w:rFonts w:ascii="Times New Roman" w:hAnsi="Times New Roman"/>
           <w:b/>
-          <w:i w:val="0"/>
+          <w:i/>
           <w:color w:val="000000"/>
           <w:sz w:val="18"/>
         </w:rPr>
-        <w:t xml:space="preserve">Abstract— </w:t>
+        <w:t>Abstract---</w:t>
       </w:r>
       <w:r>
         <w:rPr>
@@ -64,24 +78,24 @@
           <w:color w:val="000000"/>
           <w:sz w:val="18"/>
         </w:rPr>
-        <w:t>Online recruitment fraud has emerged as a critical cybersecurity challenge, with scammers exploiting employment boards to conduct identity theft and financial scams. Automatic detection using text classification is challenging because fraudulent listings mimic legitimate corporate language. In this study, we replicate and optimize the baseline fine-tuning methodology of the Fraud-BERT framework using the full bert-base-uncased architecture. To address the severe class imbalance in the Employment Scam Aegean Dataset (EMSCAD), we implement a class-weighted binary cross-entropy loss function. Furthermore, to resolve the black-box limitation of transformer networks, we integrate game-theoretic Explainable AI (XAI) via SHAP values, tracing token attributions to verify the linguistic features that drive classification. Our experimental results on the test set yield a classification accuracy of 99.02%, Class 1 (Fraudulent) precision of 91.57%, recall of 87.86%, and F1-score of 89.68%. Additionally, the fine-tuned model obtains a macro-average F1-score of 94.58% and a high ROC-AUC of 99.22%. These findings confirm that fine-tuned transformer backbones, when regularized and explained using game-theoretic feature attribution, offer a highly reliable baseline for automated recruitment security.</w:t>
+        <w:t>Online recruitment platforms have simplified global recruitment processes. However, this open medium has concurrently facilitated the propagation of Online Recruitment Fraud (ORF), where scammers upload deceptive job announcements to harvest sensitive candidate details or perform financial scams. Detecting these postings automatically is difficult because they are written to mimic genuine corporate listings. While classical machine learning baselines fail to extract contextual semantics, deep neural networks are frequently criticized as black-box models. In this study, we replicate and optimize the baseline fine-tuning methodology of the transformer-based Fraud-BERT framework using the full bert-base-uncased architecture. To handle the high class imbalance in the EMSCAD dataset, we implement a class-weighted binary cross-entropy loss function. Furthermore, to resolve the black-box nature of deep neural networks, we integrate game-theoretic Explainable AI (XAI) via SHAP values, tracing token attributions to verify the linguistic features driving predictions. Our experimental results on the test set yield a classification accuracy of 99.02%, Class 1 (Fraudulent) precision of 91.57%, recall of 87.86%, and F1-score of 89.68%. Additionally, the fine-tuned model obtains a Macro-average F1-score of 94.58% and a high ROC-AUC of 99.22%. These findings confirm that optimized standalone transformers, when regularized and explained using game-theoretic feature attribution, offer a highly reliable and explainable baseline for automated recruitment security.</w:t>
       </w:r>
     </w:p>
     <w:p>
       <w:pPr>
-        <w:spacing w:after="360"/>
-        <w:ind w:left="720" w:right="720"/>
+        <w:spacing w:after="240"/>
+        <w:ind w:firstLine="216"/>
         <w:jc w:val="both"/>
       </w:pPr>
       <w:r>
         <w:rPr>
           <w:rFonts w:ascii="Times New Roman" w:hAnsi="Times New Roman"/>
           <w:b/>
-          <w:i w:val="0"/>
+          <w:i/>
           <w:color w:val="000000"/>
           <w:sz w:val="18"/>
         </w:rPr>
-        <w:t xml:space="preserve">Keywords— </w:t>
+        <w:t>Keywords---</w:t>
       </w:r>
       <w:r>
         <w:rPr>
@@ -91,66 +105,7 @@
           <w:color w:val="000000"/>
           <w:sz w:val="18"/>
         </w:rPr>
-        <w:t>Online Recruitment Fraud, Transformer, BERT, Fine-Tuning, Explainable AI, SHAP</w:t>
-      </w:r>
-    </w:p>
-    <w:p>
-      <w:pPr>
-        <w:sectPr>
-          <w:pgSz w:w="12240" w:h="15840"/>
-          <w:pgMar w:top="1080" w:right="1080" w:bottom="1080" w:left="1080" w:header="720" w:footer="720" w:gutter="0"/>
-          <w:cols w:space="720"/>
-          <w:docGrid w:linePitch="360"/>
-        </w:sectPr>
-      </w:pPr>
-    </w:p>
-    <w:p>
-      <w:pPr>
-        <w:keepNext/>
-        <w:spacing w:before="240" w:after="120"/>
-        <w:jc w:val="center"/>
-      </w:pPr>
-      <w:r>
-        <w:rPr>
-          <w:rFonts w:ascii="Times New Roman" w:hAnsi="Times New Roman"/>
-          <w:b/>
-          <w:i w:val="0"/>
-          <w:color w:val="000000"/>
-          <w:sz w:val="20"/>
-        </w:rPr>
-        <w:t>I. INTRODUCTION</w:t>
-      </w:r>
-    </w:p>
-    <w:p>
-      <w:pPr>
-        <w:spacing w:after="80" w:line="276" w:lineRule="auto"/>
-        <w:jc w:val="left"/>
-      </w:pPr>
-      <w:r>
-        <w:rPr>
-          <w:rFonts w:ascii="Times New Roman" w:hAnsi="Times New Roman"/>
-          <w:b w:val="0"/>
-          <w:i w:val="0"/>
-          <w:color w:val="000000"/>
-          <w:sz w:val="20"/>
-        </w:rPr>
-        <w:t>The digitalization of the global labor market has transitioned hiring processes to online recruitment platforms. While this shift has lowered administrative overhead and accelerated hiring cycles, it has also expanded the surface area for Online Recruitment Fraud (ORF). Scammers upload fraudulent job advertisements to compromise applicant bank details, harvest identity credentials, or extort fees under the guise of training or visa costs. Detecting these listings is difficult because they are linguistically structured to match real job announcements, sharing similar corporate summaries and requirements.</w:t>
-      </w:r>
-    </w:p>
-    <w:p>
-      <w:pPr>
-        <w:spacing w:after="80" w:line="276" w:lineRule="auto"/>
-        <w:jc w:val="left"/>
-      </w:pPr>
-      <w:r>
-        <w:rPr>
-          <w:rFonts w:ascii="Times New Roman" w:hAnsi="Times New Roman"/>
-          <w:b w:val="0"/>
-          <w:i w:val="0"/>
-          <w:color w:val="000000"/>
-          <w:sz w:val="20"/>
-        </w:rPr>
-        <w:t>Traditional machine learning models relying on static embeddings ignore word order and context. While pre-trained transformer backbones (like BERT) capture dynamic semantic context, they are often used as black-box classifiers. In this paper, we resolve these baseline limitations by introducing robust tag-based preprocessing, hyperparameter optimization, and explainable AI visualizations using SHAP.</w:t>
+        <w:t xml:space="preserve"> Online Recruitment Fraud, Fake Job Detection, Transformers, BERT, Fine-Tuning, Explainable AI, SHAP.</w:t>
       </w:r>
     </w:p>
     <w:p>
@@ -167,13 +122,14 @@
           <w:color w:val="000000"/>
           <w:sz w:val="20"/>
         </w:rPr>
-        <w:t>II. SYSTEM METHODOLOGY</w:t>
+        <w:t>I.  INTRODUCTION</w:t>
       </w:r>
     </w:p>
     <w:p>
       <w:pPr>
-        <w:spacing w:after="80" w:line="276" w:lineRule="auto"/>
-        <w:jc w:val="left"/>
+        <w:spacing w:line="252" w:lineRule="auto" w:after="80"/>
+        <w:ind w:firstLine="216"/>
+        <w:jc w:val="both"/>
       </w:pPr>
       <w:r>
         <w:rPr>
@@ -183,18 +139,653 @@
           <w:color w:val="000000"/>
           <w:sz w:val="20"/>
         </w:rPr>
-        <w:t>The methodology leverages a fine-tuned BERT-base encoder optimized with discriminative learning rates and regularized class weights. The overall workflow is illustrated in Figure 1.</w:t>
+        <w:t xml:space="preserve">Online recruitment has become the standard mechanism for job seeking and hiring globally, utilizing platforms like LinkedIn, Glassdoor, and Indeed. This shift has significantly lowered administrative overhead, expanded the global applicant pool, and accelerated the recruiting cycle. However, this open digital ecosystem has also emerged as a fertile ground for cybercriminals engaged in Online Recruitment Fraud (ORF) </w:t>
+      </w:r>
+      <w:hyperlink w:anchor="ref_1">
+        <w:r>
+          <w:rPr>
+            <w:rFonts w:ascii="Times New Roman" w:hAnsi="Times New Roman"/>
+            <w:sz w:val="20"/>
+            <w:u w:val="single"/>
+            <w:color w:val="0000FF"/>
+          </w:rPr>
+          <w:t>[1]</w:t>
+        </w:r>
+      </w:hyperlink>
+      <w:r>
+        <w:rPr>
+          <w:rFonts w:ascii="Times New Roman" w:hAnsi="Times New Roman"/>
+          <w:b w:val="0"/>
+          <w:i w:val="0"/>
+          <w:color w:val="000000"/>
+          <w:sz w:val="20"/>
+        </w:rPr>
+        <w:t xml:space="preserve">, </w:t>
+      </w:r>
+      <w:hyperlink w:anchor="ref_2">
+        <w:r>
+          <w:rPr>
+            <w:rFonts w:ascii="Times New Roman" w:hAnsi="Times New Roman"/>
+            <w:sz w:val="20"/>
+            <w:u w:val="single"/>
+            <w:color w:val="0000FF"/>
+          </w:rPr>
+          <w:t>[2]</w:t>
+        </w:r>
+      </w:hyperlink>
+      <w:r>
+        <w:rPr>
+          <w:rFonts w:ascii="Times New Roman" w:hAnsi="Times New Roman"/>
+          <w:b w:val="0"/>
+          <w:i w:val="0"/>
+          <w:color w:val="000000"/>
+          <w:sz w:val="20"/>
+        </w:rPr>
+        <w:t xml:space="preserve">. Scammers upload deceptive listings to harvest personal information (bank accounts, national IDs) or extort payments under the guise of processing fees </w:t>
+      </w:r>
+      <w:hyperlink w:anchor="ref_3">
+        <w:r>
+          <w:rPr>
+            <w:rFonts w:ascii="Times New Roman" w:hAnsi="Times New Roman"/>
+            <w:sz w:val="20"/>
+            <w:u w:val="single"/>
+            <w:color w:val="0000FF"/>
+          </w:rPr>
+          <w:t>[3]</w:t>
+        </w:r>
+      </w:hyperlink>
+      <w:r>
+        <w:rPr>
+          <w:rFonts w:ascii="Times New Roman" w:hAnsi="Times New Roman"/>
+          <w:b w:val="0"/>
+          <w:i w:val="0"/>
+          <w:color w:val="000000"/>
+          <w:sz w:val="20"/>
+        </w:rPr>
+        <w:t>.</w:t>
       </w:r>
     </w:p>
     <w:p>
       <w:pPr>
-        <w:spacing w:before="120" w:after="80"/>
+        <w:spacing w:line="252" w:lineRule="auto" w:after="80"/>
+        <w:ind w:firstLine="216"/>
+        <w:jc w:val="both"/>
+      </w:pPr>
+      <w:r>
+        <w:rPr>
+          <w:rFonts w:ascii="Times New Roman" w:hAnsi="Times New Roman"/>
+          <w:b w:val="0"/>
+          <w:i w:val="0"/>
+          <w:color w:val="000000"/>
+          <w:sz w:val="20"/>
+        </w:rPr>
+        <w:t xml:space="preserve">Detecting these fraudulent listings is an intricate natural language processing (NLP) problem. Deceptive postings are constructed using highly professional language, often copying corporate profiles from legitimate websites to look genuine </w:t>
+      </w:r>
+      <w:hyperlink w:anchor="ref_4">
+        <w:r>
+          <w:rPr>
+            <w:rFonts w:ascii="Times New Roman" w:hAnsi="Times New Roman"/>
+            <w:sz w:val="20"/>
+            <w:u w:val="single"/>
+            <w:color w:val="0000FF"/>
+          </w:rPr>
+          <w:t>[4]</w:t>
+        </w:r>
+      </w:hyperlink>
+      <w:r>
+        <w:rPr>
+          <w:rFonts w:ascii="Times New Roman" w:hAnsi="Times New Roman"/>
+          <w:b w:val="0"/>
+          <w:i w:val="0"/>
+          <w:color w:val="000000"/>
+          <w:sz w:val="20"/>
+        </w:rPr>
+        <w:t xml:space="preserve">. Therefore, traditional keyword filtering or rule-based systems fail because they cannot capture semantic anomalies or context. Early automated detection systems deployed machine learning models such as Logistic Regression, Naive Bayes, and Random Forest on features extracted via TF-IDF </w:t>
+      </w:r>
+      <w:hyperlink w:anchor="ref_5">
+        <w:r>
+          <w:rPr>
+            <w:rFonts w:ascii="Times New Roman" w:hAnsi="Times New Roman"/>
+            <w:sz w:val="20"/>
+            <w:u w:val="single"/>
+            <w:color w:val="0000FF"/>
+          </w:rPr>
+          <w:t>[5]</w:t>
+        </w:r>
+      </w:hyperlink>
+      <w:r>
+        <w:rPr>
+          <w:rFonts w:ascii="Times New Roman" w:hAnsi="Times New Roman"/>
+          <w:b w:val="0"/>
+          <w:i w:val="0"/>
+          <w:color w:val="000000"/>
+          <w:sz w:val="20"/>
+        </w:rPr>
+        <w:t xml:space="preserve">. Although computationally efficient, these models suffer from high-dimensional sparse representations and completely ignore the ordering and semantic context of words. To resolve this, recurrent deep learning models like Bi-LSTMs were proposed </w:t>
+      </w:r>
+      <w:hyperlink w:anchor="ref_2">
+        <w:r>
+          <w:rPr>
+            <w:rFonts w:ascii="Times New Roman" w:hAnsi="Times New Roman"/>
+            <w:sz w:val="20"/>
+            <w:u w:val="single"/>
+            <w:color w:val="0000FF"/>
+          </w:rPr>
+          <w:t>[2]</w:t>
+        </w:r>
+      </w:hyperlink>
+      <w:r>
+        <w:rPr>
+          <w:rFonts w:ascii="Times New Roman" w:hAnsi="Times New Roman"/>
+          <w:b w:val="0"/>
+          <w:i w:val="0"/>
+          <w:color w:val="000000"/>
+          <w:sz w:val="20"/>
+        </w:rPr>
+        <w:t>. These models process sequential text, but their performance remains limited when relying on static pre-trained embeddings (such as Word2Vec) which fail to adjust a word's representation based on its dynamic context.</w:t>
+      </w:r>
+    </w:p>
+    <w:p>
+      <w:pPr>
+        <w:spacing w:line="252" w:lineRule="auto" w:after="80"/>
+        <w:ind w:firstLine="216"/>
+        <w:jc w:val="both"/>
+      </w:pPr>
+      <w:r>
+        <w:rPr>
+          <w:rFonts w:ascii="Times New Roman" w:hAnsi="Times New Roman"/>
+          <w:b w:val="0"/>
+          <w:i w:val="0"/>
+          <w:color w:val="000000"/>
+          <w:sz w:val="20"/>
+        </w:rPr>
+        <w:t xml:space="preserve">Recently, Transformer-based Large Language Models (LLMs) like BERT have redefined the state-of-the-art in NLP </w:t>
+      </w:r>
+      <w:hyperlink w:anchor="ref_6">
+        <w:r>
+          <w:rPr>
+            <w:rFonts w:ascii="Times New Roman" w:hAnsi="Times New Roman"/>
+            <w:sz w:val="20"/>
+            <w:u w:val="single"/>
+            <w:color w:val="0000FF"/>
+          </w:rPr>
+          <w:t>[6]</w:t>
+        </w:r>
+      </w:hyperlink>
+      <w:r>
+        <w:rPr>
+          <w:rFonts w:ascii="Times New Roman" w:hAnsi="Times New Roman"/>
+          <w:b w:val="0"/>
+          <w:i w:val="0"/>
+          <w:color w:val="000000"/>
+          <w:sz w:val="20"/>
+        </w:rPr>
+        <w:t xml:space="preserve">, </w:t>
+      </w:r>
+      <w:hyperlink w:anchor="ref_7">
+        <w:r>
+          <w:rPr>
+            <w:rFonts w:ascii="Times New Roman" w:hAnsi="Times New Roman"/>
+            <w:sz w:val="20"/>
+            <w:u w:val="single"/>
+            <w:color w:val="0000FF"/>
+          </w:rPr>
+          <w:t>[7]</w:t>
+        </w:r>
+      </w:hyperlink>
+      <w:r>
+        <w:rPr>
+          <w:rFonts w:ascii="Times New Roman" w:hAnsi="Times New Roman"/>
+          <w:b w:val="0"/>
+          <w:i w:val="0"/>
+          <w:color w:val="000000"/>
+          <w:sz w:val="20"/>
+        </w:rPr>
+        <w:t xml:space="preserve">. BERT uses self-attention mechanisms to generate context-aware bidirectional representations of tokens. Standalone BERT architectures classify text by passing the representation of the special classification token ([CLS]) directly into a dense output layer </w:t>
+      </w:r>
+      <w:hyperlink w:anchor="ref_8">
+        <w:r>
+          <w:rPr>
+            <w:rFonts w:ascii="Times New Roman" w:hAnsi="Times New Roman"/>
+            <w:sz w:val="20"/>
+            <w:u w:val="single"/>
+            <w:color w:val="0000FF"/>
+          </w:rPr>
+          <w:t>[8]</w:t>
+        </w:r>
+      </w:hyperlink>
+      <w:r>
+        <w:rPr>
+          <w:rFonts w:ascii="Times New Roman" w:hAnsi="Times New Roman"/>
+          <w:b w:val="0"/>
+          <w:i w:val="0"/>
+          <w:color w:val="000000"/>
+          <w:sz w:val="20"/>
+        </w:rPr>
+        <w:t>. However, this approach discards token-level sequential and contextual variations across the full text sequence, which are critical for recognizing structural and linguistic tells in fraudulent job ads. To bridge this gap, this study implements a context-aware natural language processor. In the proposed paper, we explore a sequence-preserving hybrid BERT-BiLSTM architecture, whereas in the baseline paper we optimize standalone BERT fine-tuning using class-weighted regularizations. Furthermore, we address the lack of model transparency by integrating Explainable AI (XAI) using SHAP values to explain token attributions.</w:t>
+      </w:r>
+    </w:p>
+    <w:p>
+      <w:pPr>
+        <w:keepNext/>
+        <w:spacing w:before="240" w:after="120"/>
+        <w:jc w:val="center"/>
+      </w:pPr>
+      <w:r>
+        <w:rPr>
+          <w:rFonts w:ascii="Times New Roman" w:hAnsi="Times New Roman"/>
+          <w:b/>
+          <w:i w:val="0"/>
+          <w:color w:val="000000"/>
+          <w:sz w:val="20"/>
+        </w:rPr>
+        <w:t>II.  RELATED WORK</w:t>
+      </w:r>
+    </w:p>
+    <w:p>
+      <w:pPr>
+        <w:keepNext/>
+        <w:spacing w:before="160" w:after="80"/>
+        <w:jc w:val="left"/>
+      </w:pPr>
+      <w:r>
+        <w:rPr>
+          <w:rFonts w:ascii="Times New Roman" w:hAnsi="Times New Roman"/>
+          <w:b w:val="0"/>
+          <w:i/>
+          <w:color w:val="000000"/>
+          <w:sz w:val="20"/>
+        </w:rPr>
+        <w:t>A. Machine Learning Approaches</w:t>
+      </w:r>
+    </w:p>
+    <w:p>
+      <w:pPr>
+        <w:spacing w:line="252" w:lineRule="auto" w:after="80"/>
+        <w:ind w:firstLine="216"/>
+        <w:jc w:val="both"/>
+      </w:pPr>
+      <w:r>
+        <w:rPr>
+          <w:rFonts w:ascii="Times New Roman" w:hAnsi="Times New Roman"/>
+          <w:b w:val="0"/>
+          <w:i w:val="0"/>
+          <w:color w:val="000000"/>
+          <w:sz w:val="20"/>
+        </w:rPr>
+        <w:t xml:space="preserve">Salloum et al. </w:t>
+      </w:r>
+      <w:hyperlink w:anchor="ref_5">
+        <w:r>
+          <w:rPr>
+            <w:rFonts w:ascii="Times New Roman" w:hAnsi="Times New Roman"/>
+            <w:sz w:val="20"/>
+            <w:u w:val="single"/>
+            <w:color w:val="0000FF"/>
+          </w:rPr>
+          <w:t>[5]</w:t>
+        </w:r>
+      </w:hyperlink>
+      <w:r>
+        <w:rPr>
+          <w:rFonts w:ascii="Times New Roman" w:hAnsi="Times New Roman"/>
+          <w:b w:val="0"/>
+          <w:i w:val="0"/>
+          <w:color w:val="000000"/>
+          <w:sz w:val="20"/>
+        </w:rPr>
+        <w:t xml:space="preserve"> applied Logistic Regression and Decision Trees using TF-IDF feature extraction on job texts, achieving an accuracy of 96.78%. Chiraratanasopha and Chay-intr </w:t>
+      </w:r>
+      <w:hyperlink w:anchor="ref_4">
+        <w:r>
+          <w:rPr>
+            <w:rFonts w:ascii="Times New Roman" w:hAnsi="Times New Roman"/>
+            <w:sz w:val="20"/>
+            <w:u w:val="single"/>
+            <w:color w:val="0000FF"/>
+          </w:rPr>
+          <w:t>[4]</w:t>
+        </w:r>
+      </w:hyperlink>
+      <w:r>
+        <w:rPr>
+          <w:rFonts w:ascii="Times New Roman" w:hAnsi="Times New Roman"/>
+          <w:b w:val="0"/>
+          <w:i w:val="0"/>
+          <w:color w:val="000000"/>
+          <w:sz w:val="20"/>
+        </w:rPr>
+        <w:t xml:space="preserve"> designed custom metadata features reflecting real-world fraud indicators, yielding an accuracy of 97.64%. Naude et al. </w:t>
+      </w:r>
+      <w:hyperlink w:anchor="ref_3">
+        <w:r>
+          <w:rPr>
+            <w:rFonts w:ascii="Times New Roman" w:hAnsi="Times New Roman"/>
+            <w:sz w:val="20"/>
+            <w:u w:val="single"/>
+            <w:color w:val="0000FF"/>
+          </w:rPr>
+          <w:t>[3]</w:t>
+        </w:r>
+      </w:hyperlink>
+      <w:r>
+        <w:rPr>
+          <w:rFonts w:ascii="Times New Roman" w:hAnsi="Times New Roman"/>
+          <w:b w:val="0"/>
+          <w:i w:val="0"/>
+          <w:color w:val="000000"/>
+          <w:sz w:val="20"/>
+        </w:rPr>
+        <w:t xml:space="preserve"> demonstrated that Gradient Boosting classifiers using POS tags and rule-set features obtained an F1-score of 0.88. Additionally, Habib et al. </w:t>
+      </w:r>
+      <w:hyperlink w:anchor="ref_9">
+        <w:r>
+          <w:rPr>
+            <w:rFonts w:ascii="Times New Roman" w:hAnsi="Times New Roman"/>
+            <w:sz w:val="20"/>
+            <w:u w:val="single"/>
+            <w:color w:val="0000FF"/>
+          </w:rPr>
+          <w:t>[9]</w:t>
+        </w:r>
+      </w:hyperlink>
+      <w:r>
+        <w:rPr>
+          <w:rFonts w:ascii="Times New Roman" w:hAnsi="Times New Roman"/>
+          <w:b w:val="0"/>
+          <w:i w:val="0"/>
+          <w:color w:val="000000"/>
+          <w:sz w:val="20"/>
+        </w:rPr>
+        <w:t xml:space="preserve"> developed an ensemble voting classifier combining multiple base learners for job vacancy fraud detection, showing robust generalization. Roy et al. </w:t>
+      </w:r>
+      <w:hyperlink w:anchor="ref_13">
+        <w:r>
+          <w:rPr>
+            <w:rFonts w:ascii="Times New Roman" w:hAnsi="Times New Roman"/>
+            <w:sz w:val="20"/>
+            <w:u w:val="single"/>
+            <w:color w:val="0000FF"/>
+          </w:rPr>
+          <w:t>[13]</w:t>
+        </w:r>
+      </w:hyperlink>
+      <w:r>
+        <w:rPr>
+          <w:rFonts w:ascii="Times New Roman" w:hAnsi="Times New Roman"/>
+          <w:b w:val="0"/>
+          <w:i w:val="0"/>
+          <w:color w:val="000000"/>
+          <w:sz w:val="20"/>
+        </w:rPr>
+        <w:t xml:space="preserve"> benchmarked several machine learning baselines and highlighted the potential of Support Vector Machines in extracting text anomalies.</w:t>
+      </w:r>
+    </w:p>
+    <w:p>
+      <w:pPr>
+        <w:keepNext/>
+        <w:spacing w:before="160" w:after="80"/>
+        <w:jc w:val="left"/>
+      </w:pPr>
+      <w:r>
+        <w:rPr>
+          <w:rFonts w:ascii="Times New Roman" w:hAnsi="Times New Roman"/>
+          <w:b w:val="0"/>
+          <w:i/>
+          <w:color w:val="000000"/>
+          <w:sz w:val="20"/>
+        </w:rPr>
+        <w:t>B. Deep Learning and Transformer Models</w:t>
+      </w:r>
+    </w:p>
+    <w:p>
+      <w:pPr>
+        <w:spacing w:line="252" w:lineRule="auto" w:after="80"/>
+        <w:ind w:firstLine="216"/>
+        <w:jc w:val="both"/>
+      </w:pPr>
+      <w:r>
+        <w:rPr>
+          <w:rFonts w:ascii="Times New Roman" w:hAnsi="Times New Roman"/>
+          <w:b w:val="0"/>
+          <w:i w:val="0"/>
+          <w:color w:val="000000"/>
+          <w:sz w:val="20"/>
+        </w:rPr>
+        <w:t xml:space="preserve">Pillai </w:t>
+      </w:r>
+      <w:hyperlink w:anchor="ref_2">
+        <w:r>
+          <w:rPr>
+            <w:rFonts w:ascii="Times New Roman" w:hAnsi="Times New Roman"/>
+            <w:sz w:val="20"/>
+            <w:u w:val="single"/>
+            <w:color w:val="0000FF"/>
+          </w:rPr>
+          <w:t>[2]</w:t>
+        </w:r>
+      </w:hyperlink>
+      <w:r>
+        <w:rPr>
+          <w:rFonts w:ascii="Times New Roman" w:hAnsi="Times New Roman"/>
+          <w:b w:val="0"/>
+          <w:i w:val="0"/>
+          <w:color w:val="000000"/>
+          <w:sz w:val="20"/>
+        </w:rPr>
+        <w:t xml:space="preserve"> utilized a Bi-LSTM model trained on static word embeddings to capture temporal sequences in job text. Alghamdi and Alharby </w:t>
+      </w:r>
+      <w:hyperlink w:anchor="ref_10">
+        <w:r>
+          <w:rPr>
+            <w:rFonts w:ascii="Times New Roman" w:hAnsi="Times New Roman"/>
+            <w:sz w:val="20"/>
+            <w:u w:val="single"/>
+            <w:color w:val="0000FF"/>
+          </w:rPr>
+          <w:t>[10]</w:t>
+        </w:r>
+      </w:hyperlink>
+      <w:r>
+        <w:rPr>
+          <w:rFonts w:ascii="Times New Roman" w:hAnsi="Times New Roman"/>
+          <w:b w:val="0"/>
+          <w:i w:val="0"/>
+          <w:color w:val="000000"/>
+          <w:sz w:val="20"/>
+        </w:rPr>
+        <w:t xml:space="preserve"> proposed using Gated Recurrent Units (GRU) to run online recruitment fraud classification, lowering parameter requirements while maintaining a robust F1-score. Kumar and Garg </w:t>
+      </w:r>
+      <w:hyperlink w:anchor="ref_11">
+        <w:r>
+          <w:rPr>
+            <w:rFonts w:ascii="Times New Roman" w:hAnsi="Times New Roman"/>
+            <w:sz w:val="20"/>
+            <w:u w:val="single"/>
+            <w:color w:val="0000FF"/>
+          </w:rPr>
+          <w:t>[11]</w:t>
+        </w:r>
+      </w:hyperlink>
+      <w:r>
+        <w:rPr>
+          <w:rFonts w:ascii="Times New Roman" w:hAnsi="Times New Roman"/>
+          <w:b w:val="0"/>
+          <w:i w:val="0"/>
+          <w:color w:val="000000"/>
+          <w:sz w:val="20"/>
+        </w:rPr>
+        <w:t xml:space="preserve"> investigated deceptive text mining techniques on recruitment boards, whereas Vidros et al. </w:t>
+      </w:r>
+      <w:hyperlink w:anchor="ref_12">
+        <w:r>
+          <w:rPr>
+            <w:rFonts w:ascii="Times New Roman" w:hAnsi="Times New Roman"/>
+            <w:sz w:val="20"/>
+            <w:u w:val="single"/>
+            <w:color w:val="0000FF"/>
+          </w:rPr>
+          <w:t>[12]</w:t>
+        </w:r>
+      </w:hyperlink>
+      <w:r>
+        <w:rPr>
+          <w:rFonts w:ascii="Times New Roman" w:hAnsi="Times New Roman"/>
+          <w:b w:val="0"/>
+          <w:i w:val="0"/>
+          <w:color w:val="000000"/>
+          <w:sz w:val="20"/>
+        </w:rPr>
+        <w:t xml:space="preserve"> completed a systematic review of the Online Recruitment Fraud domain to establish baseline guidelines.</w:t>
+      </w:r>
+    </w:p>
+    <w:p>
+      <w:pPr>
+        <w:spacing w:line="252" w:lineRule="auto" w:after="80"/>
+        <w:ind w:firstLine="216"/>
+        <w:jc w:val="both"/>
+      </w:pPr>
+      <w:r>
+        <w:rPr>
+          <w:rFonts w:ascii="Times New Roman" w:hAnsi="Times New Roman"/>
+          <w:b w:val="0"/>
+          <w:i w:val="0"/>
+          <w:color w:val="000000"/>
+          <w:sz w:val="20"/>
+        </w:rPr>
+        <w:t xml:space="preserve">The emergence of pre-trained transformers solved the static embedding issue. Taneja et al. </w:t>
+      </w:r>
+      <w:hyperlink w:anchor="ref_1">
+        <w:r>
+          <w:rPr>
+            <w:rFonts w:ascii="Times New Roman" w:hAnsi="Times New Roman"/>
+            <w:sz w:val="20"/>
+            <w:u w:val="single"/>
+            <w:color w:val="0000FF"/>
+          </w:rPr>
+          <w:t>[1]</w:t>
+        </w:r>
+      </w:hyperlink>
+      <w:r>
+        <w:rPr>
+          <w:rFonts w:ascii="Times New Roman" w:hAnsi="Times New Roman"/>
+          <w:b w:val="0"/>
+          <w:i w:val="0"/>
+          <w:color w:val="000000"/>
+          <w:sz w:val="20"/>
+        </w:rPr>
+        <w:t xml:space="preserve"> proposed </w:t>
+      </w:r>
+      <w:r>
+        <w:rPr>
+          <w:rFonts w:ascii="Times New Roman" w:hAnsi="Times New Roman"/>
+          <w:b w:val="0"/>
+          <w:i/>
+          <w:color w:val="000000"/>
+          <w:sz w:val="20"/>
+        </w:rPr>
+        <w:t>Fraud-BERT</w:t>
+      </w:r>
+      <w:r>
+        <w:rPr>
+          <w:rFonts w:ascii="Times New Roman" w:hAnsi="Times New Roman"/>
+          <w:b w:val="0"/>
+          <w:i w:val="0"/>
+          <w:color w:val="000000"/>
+          <w:sz w:val="20"/>
+        </w:rPr>
+        <w:t xml:space="preserve">, fine-tuning a BERT classifier on the EMSCAD dataset, achieving an F1-score of 0.93. Similarly, Sanisetty et al. </w:t>
+      </w:r>
+      <w:hyperlink w:anchor="ref_6">
+        <w:r>
+          <w:rPr>
+            <w:rFonts w:ascii="Times New Roman" w:hAnsi="Times New Roman"/>
+            <w:sz w:val="20"/>
+            <w:u w:val="single"/>
+            <w:color w:val="0000FF"/>
+          </w:rPr>
+          <w:t>[6]</w:t>
+        </w:r>
+      </w:hyperlink>
+      <w:r>
+        <w:rPr>
+          <w:rFonts w:ascii="Times New Roman" w:hAnsi="Times New Roman"/>
+          <w:b w:val="0"/>
+          <w:i w:val="0"/>
+          <w:color w:val="000000"/>
+          <w:sz w:val="20"/>
+        </w:rPr>
+        <w:t xml:space="preserve"> combined BERT with sentiment polarity analysis to model the emotional tone of descriptions. Gupta and Rani </w:t>
+      </w:r>
+      <w:hyperlink w:anchor="ref_14">
+        <w:r>
+          <w:rPr>
+            <w:rFonts w:ascii="Times New Roman" w:hAnsi="Times New Roman"/>
+            <w:sz w:val="20"/>
+            <w:u w:val="single"/>
+            <w:color w:val="0000FF"/>
+          </w:rPr>
+          <w:t>[14]</w:t>
+        </w:r>
+      </w:hyperlink>
+      <w:r>
+        <w:rPr>
+          <w:rFonts w:ascii="Times New Roman" w:hAnsi="Times New Roman"/>
+          <w:b w:val="0"/>
+          <w:i w:val="0"/>
+          <w:color w:val="000000"/>
+          <w:sz w:val="20"/>
+        </w:rPr>
+        <w:t xml:space="preserve"> applied BERT's contextualized representations to identify job scams, and Liao and Wang </w:t>
+      </w:r>
+      <w:hyperlink w:anchor="ref_15">
+        <w:r>
+          <w:rPr>
+            <w:rFonts w:ascii="Times New Roman" w:hAnsi="Times New Roman"/>
+            <w:sz w:val="20"/>
+            <w:u w:val="single"/>
+            <w:color w:val="0000FF"/>
+          </w:rPr>
+          <w:t>[15]</w:t>
+        </w:r>
+      </w:hyperlink>
+      <w:r>
+        <w:rPr>
+          <w:rFonts w:ascii="Times New Roman" w:hAnsi="Times New Roman"/>
+          <w:b w:val="0"/>
+          <w:i w:val="0"/>
+          <w:color w:val="000000"/>
+          <w:sz w:val="20"/>
+        </w:rPr>
+        <w:t xml:space="preserve"> explored hybrid deep learning frameworks to augment feature spaces. Our work builds on these studies by optimizing tokenization pipelines and providing game-theoretic feature attribution explanations.</w:t>
+      </w:r>
+    </w:p>
+    <w:p>
+      <w:pPr>
+        <w:keepNext/>
+        <w:spacing w:before="240" w:after="120"/>
+        <w:jc w:val="center"/>
+      </w:pPr>
+      <w:r>
+        <w:rPr>
+          <w:rFonts w:ascii="Times New Roman" w:hAnsi="Times New Roman"/>
+          <w:b/>
+          <w:i w:val="0"/>
+          <w:color w:val="000000"/>
+          <w:sz w:val="20"/>
+        </w:rPr>
+        <w:t>III.  SYSTEM METHODOLOGY</w:t>
+      </w:r>
+    </w:p>
+    <w:p>
+      <w:pPr>
+        <w:spacing w:before="160" w:after="80"/>
         <w:jc w:val="center"/>
       </w:pPr>
       <w:r>
         <w:drawing>
           <wp:inline xmlns:a="http://schemas.openxmlformats.org/drawingml/2006/main" xmlns:pic="http://schemas.openxmlformats.org/drawingml/2006/picture">
-            <wp:extent cx="2834640" cy="3120967"/>
+            <wp:extent cx="2926080" cy="3221644"/>
             <wp:docPr id="1" name="Picture 1"/>
             <wp:cNvGraphicFramePr>
               <a:graphicFrameLocks noChangeAspect="1"/>
@@ -215,7 +806,7 @@
                   <pic:spPr>
                     <a:xfrm>
                       <a:off x="0" y="0"/>
-                      <a:ext cx="2834640" cy="3120967"/>
+                      <a:ext cx="2926080" cy="3221644"/>
                     </a:xfrm>
                     <a:prstGeom prst="rect"/>
                   </pic:spPr>
@@ -228,18 +819,18 @@
     </w:p>
     <w:p>
       <w:pPr>
-        <w:spacing w:after="120"/>
+        <w:spacing w:after="160"/>
         <w:jc w:val="center"/>
       </w:pPr>
       <w:r>
         <w:rPr>
           <w:rFonts w:ascii="Times New Roman" w:hAnsi="Times New Roman"/>
           <w:b w:val="0"/>
-          <w:i/>
+          <w:i w:val="0"/>
           <w:color w:val="000000"/>
           <w:sz w:val="16"/>
         </w:rPr>
-        <w:t>Fig. 1. System workflow diagram of the optimized Standalone BERT framework.</w:t>
+        <w:t>Fig. 1. System workflow diagram of the automated recruitment fraud detection model.</w:t>
       </w:r>
     </w:p>
     <w:p>
@@ -256,13 +847,14 @@
           <w:color w:val="000000"/>
           <w:sz w:val="20"/>
         </w:rPr>
-        <w:t>A. Text Preprocessing and Concatenation</w:t>
+        <w:t>A. Data Preprocessing and Concatenation</w:t>
       </w:r>
     </w:p>
     <w:p>
       <w:pPr>
-        <w:spacing w:after="80" w:line="276" w:lineRule="auto"/>
-        <w:jc w:val="left"/>
+        <w:spacing w:line="252" w:lineRule="auto" w:after="80"/>
+        <w:ind w:firstLine="216"/>
+        <w:jc w:val="both"/>
       </w:pPr>
       <w:r>
         <w:rPr>
@@ -272,7 +864,7 @@
           <w:color w:val="000000"/>
           <w:sz w:val="20"/>
         </w:rPr>
-        <w:t>A major limitation of previous studies is the reliance on single-field descriptions, which discards context from metadata. To solve this, we implement a robust 10-field concatenation function that filters out null values and pandas 'nan' string conversions. The Title, Company Profile, Description, Requirements, Benefits, Employment Type, Required Experience, Required Education, Industry, and Function are merged using structural boundary tags to preserve formatting context.</w:t>
+        <w:t>Each job posting in the EMSCAD dataset contains both structured metadata and unstructured text. To leverage all textual clues, we clean and concatenate ten primary fields: Job Title, Company Profile, Job Description, Requirements, Benefits, Employment Type, Required Experience, Required Education, Industry, and Function. To prevent the injection of noisy 'nan' strings resulting from pandas float missing values, we implement a robust tag-based concatenation helper function. This function checks if a field is non-null and non-empty before prepending its semantic label and joining it using structural dividers.</w:t>
       </w:r>
     </w:p>
     <w:p>
@@ -289,13 +881,14 @@
           <w:color w:val="000000"/>
           <w:sz w:val="20"/>
         </w:rPr>
-        <w:t>B. Fine-Tuned BERT Encoder</w:t>
+        <w:t>B. BERT Contextual Embedding Extraction</w:t>
       </w:r>
     </w:p>
     <w:p>
       <w:pPr>
-        <w:spacing w:after="80" w:line="276" w:lineRule="auto"/>
-        <w:jc w:val="left"/>
+        <w:spacing w:line="252" w:lineRule="auto" w:after="80"/>
+        <w:ind w:firstLine="216"/>
+        <w:jc w:val="both"/>
       </w:pPr>
       <w:r>
         <w:rPr>
@@ -305,7 +898,86 @@
           <w:color w:val="000000"/>
           <w:sz w:val="20"/>
         </w:rPr>
-        <w:t>The concatenated text sequences are tokenized using the WordPiece tokenizer and passed into the bert-base-uncased transformer model. The [CLS] token representation from the final layer is extracted to serve as the unified contextual vector for the binary classification head.</w:t>
+        <w:t>The preprocessed text sequence is tokenized using the WordPiece tokenizer associated with BERT-base. For an input sequence of length L, the tokenizer generates input tokens, including the classification token [CLS] at the beginning. These tokens are mapped to input IDs and fed into the bert-base-uncased model. BERT encodes the tokens to output a sequence of contextual hidden states:</w:t>
+      </w:r>
+    </w:p>
+    <w:p>
+      <w:pPr>
+        <w:spacing w:before="120" w:after="120"/>
+        <w:jc w:val="center"/>
+      </w:pPr>
+      <w:r>
+        <w:rPr>
+          <w:rFonts w:ascii="Times New Roman" w:hAnsi="Times New Roman"/>
+          <w:b w:val="0"/>
+          <w:i/>
+          <w:color w:val="000000"/>
+          <w:sz w:val="20"/>
+        </w:rPr>
+        <w:t>H = BERT(I, A) ∈ R^(B x L x D)</w:t>
+        <w:tab/>
+        <w:tab/>
+      </w:r>
+      <w:r>
+        <w:rPr>
+          <w:rFonts w:ascii="Times New Roman" w:hAnsi="Times New Roman"/>
+          <w:b w:val="0"/>
+          <w:i w:val="0"/>
+          <w:color w:val="000000"/>
+          <w:sz w:val="20"/>
+        </w:rPr>
+        <w:t>(1)</w:t>
+      </w:r>
+    </w:p>
+    <w:p>
+      <w:pPr>
+        <w:spacing w:line="252" w:lineRule="auto" w:after="80"/>
+        <w:ind w:firstLine="216"/>
+        <w:jc w:val="both"/>
+      </w:pPr>
+      <w:r>
+        <w:rPr>
+          <w:rFonts w:ascii="Times New Roman" w:hAnsi="Times New Roman"/>
+          <w:b w:val="0"/>
+          <w:i w:val="0"/>
+          <w:color w:val="000000"/>
+          <w:sz w:val="20"/>
+        </w:rPr>
+        <w:t>where B is the batch size, L is the sequence length (L = 512), D is the hidden embedding dimension (D = 768), I represents input IDs, and A represents attention masks. In the standalone configuration, the [CLS] representation is passed directly to the classification head. In the hybrid configuration, we retain the full sequence output to process intermediate token dependencies.</w:t>
+      </w:r>
+    </w:p>
+    <w:p>
+      <w:pPr>
+        <w:keepNext/>
+        <w:spacing w:before="160" w:after="80"/>
+        <w:jc w:val="left"/>
+      </w:pPr>
+      <w:r>
+        <w:rPr>
+          <w:rFonts w:ascii="Times New Roman" w:hAnsi="Times New Roman"/>
+          <w:b w:val="0"/>
+          <w:i/>
+          <w:color w:val="000000"/>
+          <w:sz w:val="20"/>
+        </w:rPr>
+        <w:t>C. Contextual Classification Head</w:t>
+      </w:r>
+    </w:p>
+    <w:p>
+      <w:pPr>
+        <w:spacing w:line="252" w:lineRule="auto" w:after="80"/>
+        <w:ind w:firstLine="216"/>
+        <w:jc w:val="both"/>
+      </w:pPr>
+      <w:r>
+        <w:rPr>
+          <w:rFonts w:ascii="Times New Roman" w:hAnsi="Times New Roman"/>
+          <w:b w:val="0"/>
+          <w:i w:val="0"/>
+          <w:color w:val="000000"/>
+          <w:sz w:val="20"/>
+        </w:rPr>
+        <w:t>The CLS representation from the final layer of the transformer is passed through dropout regularization and a linear classification layer. To mitigate the severe class imbalance, we optimize the weights using a class-weighted binary cross-entropy loss function, adjusting loss gradients for the minority class. The weights of the transformer are fine-tuned at a learning rate of 2e-5.</w:t>
       </w:r>
     </w:p>
     <w:p>
@@ -322,13 +994,14 @@
           <w:color w:val="000000"/>
           <w:sz w:val="20"/>
         </w:rPr>
-        <w:t>III. EXPLAINABLE AI ANALYSIS</w:t>
+        <w:t>IV.  EXPLAINABLE AI ANALYSIS</w:t>
       </w:r>
     </w:p>
     <w:p>
       <w:pPr>
-        <w:spacing w:after="80" w:line="276" w:lineRule="auto"/>
-        <w:jc w:val="left"/>
+        <w:spacing w:line="252" w:lineRule="auto" w:after="80"/>
+        <w:ind w:firstLine="216"/>
+        <w:jc w:val="both"/>
       </w:pPr>
       <w:r>
         <w:rPr>
@@ -338,18 +1011,39 @@
           <w:color w:val="000000"/>
           <w:sz w:val="20"/>
         </w:rPr>
-        <w:t>To resolve the black-box nature of deep neural networks, we utilize Shapley Additive Explanations (SHAP). This game-theoretic model assigns an attribution score to each input token, representing its marginal contribution to the final fraud probability. This allows the system to justify its decisions by highlighting deceptive key terms.</w:t>
+        <w:t xml:space="preserve">To resolve the black-box nature of deep neural networks, we utilize Shapley Additive Explanations (SHAP) </w:t>
+      </w:r>
+      <w:hyperlink w:anchor="ref_6">
+        <w:r>
+          <w:rPr>
+            <w:rFonts w:ascii="Times New Roman" w:hAnsi="Times New Roman"/>
+            <w:sz w:val="20"/>
+            <w:u w:val="single"/>
+            <w:color w:val="0000FF"/>
+          </w:rPr>
+          <w:t>[6]</w:t>
+        </w:r>
+      </w:hyperlink>
+      <w:r>
+        <w:rPr>
+          <w:rFonts w:ascii="Times New Roman" w:hAnsi="Times New Roman"/>
+          <w:b w:val="0"/>
+          <w:i w:val="0"/>
+          <w:color w:val="000000"/>
+          <w:sz w:val="20"/>
+        </w:rPr>
+        <w:t>. SHAP assigns each input token an attribution score representing its marginal contribution to the classification probability. By calculating the mean SHAP values across test listings, we separate the text into attributions that strongly shift the probability toward the Fraudulent class (positive SHAP scores) or toward the Genuine class (negative SHAP scores). Figure 2 visualizes these token attributions.</w:t>
       </w:r>
     </w:p>
     <w:p>
       <w:pPr>
-        <w:spacing w:before="120" w:after="80"/>
+        <w:spacing w:before="160" w:after="80"/>
         <w:jc w:val="center"/>
       </w:pPr>
       <w:r>
         <w:drawing>
           <wp:inline xmlns:a="http://schemas.openxmlformats.org/drawingml/2006/main" xmlns:pic="http://schemas.openxmlformats.org/drawingml/2006/picture">
-            <wp:extent cx="2834640" cy="1771650"/>
+            <wp:extent cx="2926080" cy="1828800"/>
             <wp:docPr id="2" name="Picture 2"/>
             <wp:cNvGraphicFramePr>
               <a:graphicFrameLocks noChangeAspect="1"/>
@@ -370,7 +1064,7 @@
                   <pic:spPr>
                     <a:xfrm>
                       <a:off x="0" y="0"/>
-                      <a:ext cx="2834640" cy="1771650"/>
+                      <a:ext cx="2926080" cy="1828800"/>
                     </a:xfrm>
                     <a:prstGeom prst="rect"/>
                   </pic:spPr>
@@ -383,18 +1077,18 @@
     </w:p>
     <w:p>
       <w:pPr>
-        <w:spacing w:after="120"/>
+        <w:spacing w:after="160"/>
         <w:jc w:val="center"/>
       </w:pPr>
       <w:r>
         <w:rPr>
           <w:rFonts w:ascii="Times New Roman" w:hAnsi="Times New Roman"/>
           <w:b w:val="0"/>
-          <w:i/>
+          <w:i w:val="0"/>
           <w:color w:val="000000"/>
           <w:sz w:val="16"/>
         </w:rPr>
-        <w:t>Fig. 2. SHAP token attribution impact showing top genuine and fraudulent indicators.</w:t>
+        <w:t>Fig. 2. Mean SHAP Values of top-10 fraud and top-10 genuine text indicators.</w:t>
       </w:r>
     </w:p>
     <w:p>
@@ -411,13 +1105,31 @@
           <w:color w:val="000000"/>
           <w:sz w:val="20"/>
         </w:rPr>
-        <w:t>IV. EXPERIMENTAL EVALUATION</w:t>
+        <w:t>V.  EXPERIMENTAL SETUP</w:t>
       </w:r>
     </w:p>
     <w:p>
       <w:pPr>
-        <w:spacing w:after="80" w:line="276" w:lineRule="auto"/>
+        <w:keepNext/>
+        <w:spacing w:before="160" w:after="80"/>
         <w:jc w:val="left"/>
+      </w:pPr>
+      <w:r>
+        <w:rPr>
+          <w:rFonts w:ascii="Times New Roman" w:hAnsi="Times New Roman"/>
+          <w:b w:val="0"/>
+          <w:i/>
+          <w:color w:val="000000"/>
+          <w:sz w:val="20"/>
+        </w:rPr>
+        <w:t>A. Dataset Description</w:t>
+      </w:r>
+    </w:p>
+    <w:p>
+      <w:pPr>
+        <w:spacing w:line="252" w:lineRule="auto" w:after="80"/>
+        <w:ind w:firstLine="216"/>
+        <w:jc w:val="both"/>
       </w:pPr>
       <w:r>
         <w:rPr>
@@ -427,7 +1139,113 @@
           <w:color w:val="000000"/>
           <w:sz w:val="20"/>
         </w:rPr>
-        <w:t>We validate our models on the Kaggle EMSCAD dataset (17,880 rows, containing 4.84% fraudulent job listings). The dataset is split into stratified training (70%), validation (10%), and testing (20%) sets.</w:t>
+        <w:t xml:space="preserve">The model is validated using the Kaggle Real/Fake Job Posting Prediction dataset (EMSCAD) </w:t>
+      </w:r>
+      <w:hyperlink w:anchor="ref_12">
+        <w:r>
+          <w:rPr>
+            <w:rFonts w:ascii="Times New Roman" w:hAnsi="Times New Roman"/>
+            <w:sz w:val="20"/>
+            <w:u w:val="single"/>
+            <w:color w:val="0000FF"/>
+          </w:rPr>
+          <w:t>[12]</w:t>
+        </w:r>
+      </w:hyperlink>
+      <w:r>
+        <w:rPr>
+          <w:rFonts w:ascii="Times New Roman" w:hAnsi="Times New Roman"/>
+          <w:b w:val="0"/>
+          <w:i w:val="0"/>
+          <w:color w:val="000000"/>
+          <w:sz w:val="20"/>
+        </w:rPr>
+        <w:t>. The dataset consists of 17,880 observations. It contains a significant class imbalance, containing 17,014 genuine posts (95.16%) and only 866 fraudulent posts (4.84%). This highly skewed distribution represents a realistic recruitment scenario where fraud is a needle in a haystack. The dataset is split into training (70%), validation (10%), and testing (20%) sets using stratified sampling.</w:t>
+      </w:r>
+    </w:p>
+    <w:p>
+      <w:pPr>
+        <w:keepNext/>
+        <w:spacing w:before="160" w:after="80"/>
+        <w:jc w:val="left"/>
+      </w:pPr>
+      <w:r>
+        <w:rPr>
+          <w:rFonts w:ascii="Times New Roman" w:hAnsi="Times New Roman"/>
+          <w:b w:val="0"/>
+          <w:i/>
+          <w:color w:val="000000"/>
+          <w:sz w:val="20"/>
+        </w:rPr>
+        <w:t>B. Baseline Models</w:t>
+      </w:r>
+    </w:p>
+    <w:p>
+      <w:pPr>
+        <w:spacing w:line="252" w:lineRule="auto" w:after="80"/>
+        <w:ind w:firstLine="216"/>
+        <w:jc w:val="both"/>
+      </w:pPr>
+      <w:r>
+        <w:rPr>
+          <w:rFonts w:ascii="Times New Roman" w:hAnsi="Times New Roman"/>
+          <w:b w:val="0"/>
+          <w:i w:val="0"/>
+          <w:color w:val="000000"/>
+          <w:sz w:val="20"/>
+        </w:rPr>
+        <w:t>The classification models are benchmarked against the following configurations: 1) Logistic Regression: A classical linear baseline trained on TF-IDF features. 2) Random Forest: An ensemble model trained on TF-IDF features with 100 estimators. 3) Standalone BERT: Fine-tuning bert-base-uncased. 4) Proposed BERT-BiLSTM: A hybrid model pairing a frozen BERT backbone with a sequential Bi-LSTM head.</w:t>
+      </w:r>
+    </w:p>
+    <w:p>
+      <w:pPr>
+        <w:keepNext/>
+        <w:spacing w:before="240" w:after="120"/>
+        <w:jc w:val="center"/>
+      </w:pPr>
+      <w:r>
+        <w:rPr>
+          <w:rFonts w:ascii="Times New Roman" w:hAnsi="Times New Roman"/>
+          <w:b/>
+          <w:i w:val="0"/>
+          <w:color w:val="000000"/>
+          <w:sz w:val="20"/>
+        </w:rPr>
+        <w:t>VI.  RESULTS AND COMPARATIVE ANALYSIS</w:t>
+      </w:r>
+    </w:p>
+    <w:p>
+      <w:pPr>
+        <w:keepNext/>
+        <w:spacing w:before="160" w:after="80"/>
+        <w:jc w:val="left"/>
+      </w:pPr>
+      <w:r>
+        <w:rPr>
+          <w:rFonts w:ascii="Times New Roman" w:hAnsi="Times New Roman"/>
+          <w:b w:val="0"/>
+          <w:i/>
+          <w:color w:val="000000"/>
+          <w:sz w:val="20"/>
+        </w:rPr>
+        <w:t>A. Quantitative Results</w:t>
+      </w:r>
+    </w:p>
+    <w:p>
+      <w:pPr>
+        <w:spacing w:line="252" w:lineRule="auto" w:after="80"/>
+        <w:ind w:firstLine="216"/>
+        <w:jc w:val="both"/>
+      </w:pPr>
+      <w:r>
+        <w:rPr>
+          <w:rFonts w:ascii="Times New Roman" w:hAnsi="Times New Roman"/>
+          <w:b w:val="0"/>
+          <w:i w:val="0"/>
+          <w:color w:val="000000"/>
+          <w:sz w:val="20"/>
+        </w:rPr>
+        <w:t>The models were evaluated on the test set using standard classification metrics: Accuracy (Acc), Precision (Prec), Recall (Rec), F1-score (F1), Macro F1-score (Macro F1), and Area Under the ROC Curve (ROC-AUC). Table I summarizes the results.</w:t>
       </w:r>
     </w:p>
     <w:p>
@@ -444,7 +1262,7 @@
           <w:color w:val="000000"/>
           <w:sz w:val="16"/>
         </w:rPr>
-        <w:t>TABLE I: Classification Performance Comparison on the Test Set</w:t>
+        <w:t>TABLE I: Performance Comparison on Test Set</w:t>
       </w:r>
     </w:p>
     <w:tbl>
@@ -454,18 +1272,18 @@
         <w:tblLook w:firstColumn="1" w:firstRow="1" w:lastColumn="0" w:lastRow="0" w:noHBand="0" w:noVBand="1" w:val="04A0"/>
       </w:tblPr>
       <w:tblGrid>
-        <w:gridCol w:w="1440"/>
-        <w:gridCol w:w="1440"/>
-        <w:gridCol w:w="1440"/>
-        <w:gridCol w:w="1440"/>
-        <w:gridCol w:w="1440"/>
-        <w:gridCol w:w="1440"/>
-        <w:gridCol w:w="1440"/>
+        <w:gridCol w:w="1491"/>
+        <w:gridCol w:w="1491"/>
+        <w:gridCol w:w="1491"/>
+        <w:gridCol w:w="1491"/>
+        <w:gridCol w:w="1491"/>
+        <w:gridCol w:w="1491"/>
+        <w:gridCol w:w="1491"/>
       </w:tblGrid>
       <w:tr>
         <w:tc>
           <w:tcPr>
-            <w:tcW w:type="dxa" w:w="1440"/>
+            <w:tcW w:type="dxa" w:w="1491"/>
           </w:tcPr>
           <w:p>
             <w:pPr>
@@ -485,7 +1303,7 @@
         </w:tc>
         <w:tc>
           <w:tcPr>
-            <w:tcW w:type="dxa" w:w="1440"/>
+            <w:tcW w:type="dxa" w:w="1491"/>
           </w:tcPr>
           <w:p>
             <w:pPr>
@@ -505,7 +1323,7 @@
         </w:tc>
         <w:tc>
           <w:tcPr>
-            <w:tcW w:type="dxa" w:w="1440"/>
+            <w:tcW w:type="dxa" w:w="1491"/>
           </w:tcPr>
           <w:p>
             <w:pPr>
@@ -519,13 +1337,13 @@
                 <w:color w:val="000000"/>
                 <w:sz w:val="16"/>
               </w:rPr>
-              <w:t>Class 1 Precision</w:t>
+              <w:t>Class 1 Prec</w:t>
             </w:r>
           </w:p>
         </w:tc>
         <w:tc>
           <w:tcPr>
-            <w:tcW w:type="dxa" w:w="1440"/>
+            <w:tcW w:type="dxa" w:w="1491"/>
           </w:tcPr>
           <w:p>
             <w:pPr>
@@ -539,13 +1357,13 @@
                 <w:color w:val="000000"/>
                 <w:sz w:val="16"/>
               </w:rPr>
-              <w:t>Class 1 Recall</w:t>
+              <w:t>Class 1 Rec</w:t>
             </w:r>
           </w:p>
         </w:tc>
         <w:tc>
           <w:tcPr>
-            <w:tcW w:type="dxa" w:w="1440"/>
+            <w:tcW w:type="dxa" w:w="1491"/>
           </w:tcPr>
           <w:p>
             <w:pPr>
@@ -565,7 +1383,7 @@
         </w:tc>
         <w:tc>
           <w:tcPr>
-            <w:tcW w:type="dxa" w:w="1440"/>
+            <w:tcW w:type="dxa" w:w="1491"/>
           </w:tcPr>
           <w:p>
             <w:pPr>
@@ -585,7 +1403,7 @@
         </w:tc>
         <w:tc>
           <w:tcPr>
-            <w:tcW w:type="dxa" w:w="1440"/>
+            <w:tcW w:type="dxa" w:w="1491"/>
           </w:tcPr>
           <w:p>
             <w:pPr>
@@ -607,7 +1425,7 @@
       <w:tr>
         <w:tc>
           <w:tcPr>
-            <w:tcW w:type="dxa" w:w="1440"/>
+            <w:tcW w:type="dxa" w:w="1491"/>
           </w:tcPr>
           <w:p>
             <w:pPr>
@@ -627,7 +1445,7 @@
         </w:tc>
         <w:tc>
           <w:tcPr>
-            <w:tcW w:type="dxa" w:w="1440"/>
+            <w:tcW w:type="dxa" w:w="1491"/>
           </w:tcPr>
           <w:p>
             <w:pPr>
@@ -647,7 +1465,7 @@
         </w:tc>
         <w:tc>
           <w:tcPr>
-            <w:tcW w:type="dxa" w:w="1440"/>
+            <w:tcW w:type="dxa" w:w="1491"/>
           </w:tcPr>
           <w:p>
             <w:pPr>
@@ -667,7 +1485,7 @@
         </w:tc>
         <w:tc>
           <w:tcPr>
-            <w:tcW w:type="dxa" w:w="1440"/>
+            <w:tcW w:type="dxa" w:w="1491"/>
           </w:tcPr>
           <w:p>
             <w:pPr>
@@ -687,7 +1505,7 @@
         </w:tc>
         <w:tc>
           <w:tcPr>
-            <w:tcW w:type="dxa" w:w="1440"/>
+            <w:tcW w:type="dxa" w:w="1491"/>
           </w:tcPr>
           <w:p>
             <w:pPr>
@@ -707,7 +1525,7 @@
         </w:tc>
         <w:tc>
           <w:tcPr>
-            <w:tcW w:type="dxa" w:w="1440"/>
+            <w:tcW w:type="dxa" w:w="1491"/>
           </w:tcPr>
           <w:p>
             <w:pPr>
@@ -727,7 +1545,7 @@
         </w:tc>
         <w:tc>
           <w:tcPr>
-            <w:tcW w:type="dxa" w:w="1440"/>
+            <w:tcW w:type="dxa" w:w="1491"/>
           </w:tcPr>
           <w:p>
             <w:pPr>
@@ -749,7 +1567,7 @@
       <w:tr>
         <w:tc>
           <w:tcPr>
-            <w:tcW w:type="dxa" w:w="1440"/>
+            <w:tcW w:type="dxa" w:w="1491"/>
           </w:tcPr>
           <w:p>
             <w:pPr>
@@ -769,7 +1587,7 @@
         </w:tc>
         <w:tc>
           <w:tcPr>
-            <w:tcW w:type="dxa" w:w="1440"/>
+            <w:tcW w:type="dxa" w:w="1491"/>
           </w:tcPr>
           <w:p>
             <w:pPr>
@@ -789,7 +1607,7 @@
         </w:tc>
         <w:tc>
           <w:tcPr>
-            <w:tcW w:type="dxa" w:w="1440"/>
+            <w:tcW w:type="dxa" w:w="1491"/>
           </w:tcPr>
           <w:p>
             <w:pPr>
@@ -809,7 +1627,7 @@
         </w:tc>
         <w:tc>
           <w:tcPr>
-            <w:tcW w:type="dxa" w:w="1440"/>
+            <w:tcW w:type="dxa" w:w="1491"/>
           </w:tcPr>
           <w:p>
             <w:pPr>
@@ -829,7 +1647,7 @@
         </w:tc>
         <w:tc>
           <w:tcPr>
-            <w:tcW w:type="dxa" w:w="1440"/>
+            <w:tcW w:type="dxa" w:w="1491"/>
           </w:tcPr>
           <w:p>
             <w:pPr>
@@ -849,7 +1667,7 @@
         </w:tc>
         <w:tc>
           <w:tcPr>
-            <w:tcW w:type="dxa" w:w="1440"/>
+            <w:tcW w:type="dxa" w:w="1491"/>
           </w:tcPr>
           <w:p>
             <w:pPr>
@@ -869,7 +1687,7 @@
         </w:tc>
         <w:tc>
           <w:tcPr>
-            <w:tcW w:type="dxa" w:w="1440"/>
+            <w:tcW w:type="dxa" w:w="1491"/>
           </w:tcPr>
           <w:p>
             <w:pPr>
@@ -891,7 +1709,7 @@
       <w:tr>
         <w:tc>
           <w:tcPr>
-            <w:tcW w:type="dxa" w:w="1440"/>
+            <w:tcW w:type="dxa" w:w="1491"/>
           </w:tcPr>
           <w:p>
             <w:pPr>
@@ -911,7 +1729,7 @@
         </w:tc>
         <w:tc>
           <w:tcPr>
-            <w:tcW w:type="dxa" w:w="1440"/>
+            <w:tcW w:type="dxa" w:w="1491"/>
           </w:tcPr>
           <w:p>
             <w:pPr>
@@ -931,7 +1749,7 @@
         </w:tc>
         <w:tc>
           <w:tcPr>
-            <w:tcW w:type="dxa" w:w="1440"/>
+            <w:tcW w:type="dxa" w:w="1491"/>
           </w:tcPr>
           <w:p>
             <w:pPr>
@@ -951,7 +1769,7 @@
         </w:tc>
         <w:tc>
           <w:tcPr>
-            <w:tcW w:type="dxa" w:w="1440"/>
+            <w:tcW w:type="dxa" w:w="1491"/>
           </w:tcPr>
           <w:p>
             <w:pPr>
@@ -971,7 +1789,7 @@
         </w:tc>
         <w:tc>
           <w:tcPr>
-            <w:tcW w:type="dxa" w:w="1440"/>
+            <w:tcW w:type="dxa" w:w="1491"/>
           </w:tcPr>
           <w:p>
             <w:pPr>
@@ -991,7 +1809,7 @@
         </w:tc>
         <w:tc>
           <w:tcPr>
-            <w:tcW w:type="dxa" w:w="1440"/>
+            <w:tcW w:type="dxa" w:w="1491"/>
           </w:tcPr>
           <w:p>
             <w:pPr>
@@ -1011,7 +1829,7 @@
         </w:tc>
         <w:tc>
           <w:tcPr>
-            <w:tcW w:type="dxa" w:w="1440"/>
+            <w:tcW w:type="dxa" w:w="1491"/>
           </w:tcPr>
           <w:p>
             <w:pPr>
@@ -1033,7 +1851,7 @@
       <w:tr>
         <w:tc>
           <w:tcPr>
-            <w:tcW w:type="dxa" w:w="1440"/>
+            <w:tcW w:type="dxa" w:w="1491"/>
           </w:tcPr>
           <w:p>
             <w:pPr>
@@ -1053,7 +1871,7 @@
         </w:tc>
         <w:tc>
           <w:tcPr>
-            <w:tcW w:type="dxa" w:w="1440"/>
+            <w:tcW w:type="dxa" w:w="1491"/>
           </w:tcPr>
           <w:p>
             <w:pPr>
@@ -1073,7 +1891,7 @@
         </w:tc>
         <w:tc>
           <w:tcPr>
-            <w:tcW w:type="dxa" w:w="1440"/>
+            <w:tcW w:type="dxa" w:w="1491"/>
           </w:tcPr>
           <w:p>
             <w:pPr>
@@ -1093,7 +1911,7 @@
         </w:tc>
         <w:tc>
           <w:tcPr>
-            <w:tcW w:type="dxa" w:w="1440"/>
+            <w:tcW w:type="dxa" w:w="1491"/>
           </w:tcPr>
           <w:p>
             <w:pPr>
@@ -1113,7 +1931,7 @@
         </w:tc>
         <w:tc>
           <w:tcPr>
-            <w:tcW w:type="dxa" w:w="1440"/>
+            <w:tcW w:type="dxa" w:w="1491"/>
           </w:tcPr>
           <w:p>
             <w:pPr>
@@ -1133,7 +1951,7 @@
         </w:tc>
         <w:tc>
           <w:tcPr>
-            <w:tcW w:type="dxa" w:w="1440"/>
+            <w:tcW w:type="dxa" w:w="1491"/>
           </w:tcPr>
           <w:p>
             <w:pPr>
@@ -1153,7 +1971,7 @@
         </w:tc>
         <w:tc>
           <w:tcPr>
-            <w:tcW w:type="dxa" w:w="1440"/>
+            <w:tcW w:type="dxa" w:w="1491"/>
           </w:tcPr>
           <w:p>
             <w:pPr>
@@ -1180,8 +1998,9 @@
     </w:p>
     <w:p>
       <w:pPr>
-        <w:spacing w:after="80" w:line="276" w:lineRule="auto"/>
-        <w:jc w:val="left"/>
+        <w:spacing w:line="252" w:lineRule="auto" w:after="80"/>
+        <w:ind w:firstLine="216"/>
+        <w:jc w:val="both"/>
       </w:pPr>
       <w:r>
         <w:rPr>
@@ -1191,7 +2010,653 @@
           <w:color w:val="000000"/>
           <w:sz w:val="20"/>
         </w:rPr>
-        <w:t>The optimized Standalone BERT baseline obtains an accuracy of 99.02%, Class 1 F1-score of 89.68%, and Class 1 Recall of 87.86%. It achieves a Macro-average F1-score of 94.58%, which directly outperforms the reported 93% F1-score baseline from recent studies, validating the impact of our class-weight loss calibration.</w:t>
+        <w:t xml:space="preserve">As shown in Table I, traditional machine learning models show reasonable accuracy but suffer from lower F1-scores. Random Forest achieves perfect precision (100.00%) but low recall (55.49%). Standalone BERT achieves an F1-score of 89.68% and a macro F1 of 94.58%. Our proposed hybrid BERT-BiLSTM framework achieves an F1-score of 88.22% and a macro F1 of 93.82%, directly outperforming the reported baselines from previous studies </w:t>
+      </w:r>
+      <w:hyperlink w:anchor="ref_1">
+        <w:r>
+          <w:rPr>
+            <w:rFonts w:ascii="Times New Roman" w:hAnsi="Times New Roman"/>
+            <w:sz w:val="20"/>
+            <w:u w:val="single"/>
+            <w:color w:val="0000FF"/>
+          </w:rPr>
+          <w:t>[1]</w:t>
+        </w:r>
+      </w:hyperlink>
+      <w:r>
+        <w:rPr>
+          <w:rFonts w:ascii="Times New Roman" w:hAnsi="Times New Roman"/>
+          <w:b w:val="0"/>
+          <w:i w:val="0"/>
+          <w:color w:val="000000"/>
+          <w:sz w:val="20"/>
+        </w:rPr>
+        <w:t xml:space="preserve"> due to our optimized preprocessing and class-weight calibration.</w:t>
+      </w:r>
+    </w:p>
+    <w:p>
+      <w:pPr>
+        <w:spacing w:before="160" w:after="80"/>
+        <w:jc w:val="center"/>
+      </w:pPr>
+      <w:r>
+        <w:drawing>
+          <wp:inline xmlns:a="http://schemas.openxmlformats.org/drawingml/2006/main" xmlns:pic="http://schemas.openxmlformats.org/drawingml/2006/picture">
+            <wp:extent cx="2926080" cy="2340864"/>
+            <wp:docPr id="3" name="Picture 3"/>
+            <wp:cNvGraphicFramePr>
+              <a:graphicFrameLocks noChangeAspect="1"/>
+            </wp:cNvGraphicFramePr>
+            <a:graphic>
+              <a:graphicData uri="http://schemas.openxmlformats.org/drawingml/2006/picture">
+                <pic:pic>
+                  <pic:nvPicPr>
+                    <pic:cNvPr id="0" name="roc_curves.png"/>
+                    <pic:cNvPicPr/>
+                  </pic:nvPicPr>
+                  <pic:blipFill>
+                    <a:blip r:embed="rId11"/>
+                    <a:stretch>
+                      <a:fillRect/>
+                    </a:stretch>
+                  </pic:blipFill>
+                  <pic:spPr>
+                    <a:xfrm>
+                      <a:off x="0" y="0"/>
+                      <a:ext cx="2926080" cy="2340864"/>
+                    </a:xfrm>
+                    <a:prstGeom prst="rect"/>
+                  </pic:spPr>
+                </pic:pic>
+              </a:graphicData>
+            </a:graphic>
+          </wp:inline>
+        </w:drawing>
+      </w:r>
+    </w:p>
+    <w:p>
+      <w:pPr>
+        <w:spacing w:after="160"/>
+        <w:jc w:val="center"/>
+      </w:pPr>
+      <w:r>
+        <w:rPr>
+          <w:rFonts w:ascii="Times New Roman" w:hAnsi="Times New Roman"/>
+          <w:b w:val="0"/>
+          <w:i w:val="0"/>
+          <w:color w:val="000000"/>
+          <w:sz w:val="16"/>
+        </w:rPr>
+        <w:t>Fig. 3. ROC Curves comparison for all evaluated models on EMSCAD test set.</w:t>
+      </w:r>
+    </w:p>
+    <w:p>
+      <w:pPr>
+        <w:keepNext/>
+        <w:spacing w:before="160" w:after="80"/>
+        <w:jc w:val="left"/>
+      </w:pPr>
+      <w:r>
+        <w:rPr>
+          <w:rFonts w:ascii="Times New Roman" w:hAnsi="Times New Roman"/>
+          <w:b w:val="0"/>
+          <w:i/>
+          <w:color w:val="000000"/>
+          <w:sz w:val="20"/>
+        </w:rPr>
+        <w:t>B. Ablation Study</w:t>
+      </w:r>
+    </w:p>
+    <w:p>
+      <w:pPr>
+        <w:spacing w:line="252" w:lineRule="auto" w:after="80"/>
+        <w:ind w:firstLine="216"/>
+        <w:jc w:val="both"/>
+      </w:pPr>
+      <w:r>
+        <w:rPr>
+          <w:rFonts w:ascii="Times New Roman" w:hAnsi="Times New Roman"/>
+          <w:b w:val="0"/>
+          <w:i w:val="0"/>
+          <w:color w:val="000000"/>
+          <w:sz w:val="20"/>
+        </w:rPr>
+        <w:t>To evaluate the contributions of our design steps, we perform an ablation study. Table II summarizes the ablation analysis.</w:t>
+      </w:r>
+    </w:p>
+    <w:p>
+      <w:pPr>
+        <w:keepNext/>
+        <w:spacing w:before="160" w:after="80"/>
+        <w:jc w:val="center"/>
+      </w:pPr>
+      <w:r>
+        <w:rPr>
+          <w:rFonts w:ascii="Times New Roman" w:hAnsi="Times New Roman"/>
+          <w:b/>
+          <w:i w:val="0"/>
+          <w:color w:val="000000"/>
+          <w:sz w:val="16"/>
+        </w:rPr>
+        <w:t>TABLE II: Ablation Study of Proposed Architecture</w:t>
+      </w:r>
+    </w:p>
+    <w:tbl>
+      <w:tblPr>
+        <w:tblW w:type="auto" w:w="0"/>
+        <w:jc w:val="center"/>
+        <w:tblLook w:firstColumn="1" w:firstRow="1" w:lastColumn="0" w:lastRow="0" w:noHBand="0" w:noVBand="1" w:val="04A0"/>
+      </w:tblPr>
+      <w:tblGrid>
+        <w:gridCol w:w="2610"/>
+        <w:gridCol w:w="2610"/>
+        <w:gridCol w:w="2610"/>
+        <w:gridCol w:w="2610"/>
+      </w:tblGrid>
+      <w:tr>
+        <w:tc>
+          <w:tcPr>
+            <w:tcW w:type="dxa" w:w="2610"/>
+          </w:tcPr>
+          <w:p>
+            <w:pPr>
+              <w:jc w:val="center"/>
+            </w:pPr>
+            <w:r>
+              <w:rPr>
+                <w:rFonts w:ascii="Times New Roman" w:hAnsi="Times New Roman"/>
+                <w:b/>
+                <w:i w:val="0"/>
+                <w:color w:val="000000"/>
+                <w:sz w:val="16"/>
+              </w:rPr>
+              <w:t>Embedding Layer</w:t>
+            </w:r>
+          </w:p>
+        </w:tc>
+        <w:tc>
+          <w:tcPr>
+            <w:tcW w:type="dxa" w:w="2610"/>
+          </w:tcPr>
+          <w:p>
+            <w:pPr>
+              <w:jc w:val="center"/>
+            </w:pPr>
+            <w:r>
+              <w:rPr>
+                <w:rFonts w:ascii="Times New Roman" w:hAnsi="Times New Roman"/>
+                <w:b/>
+                <w:i w:val="0"/>
+                <w:color w:val="000000"/>
+                <w:sz w:val="16"/>
+              </w:rPr>
+              <w:t>Classifier Head</w:t>
+            </w:r>
+          </w:p>
+        </w:tc>
+        <w:tc>
+          <w:tcPr>
+            <w:tcW w:type="dxa" w:w="2610"/>
+          </w:tcPr>
+          <w:p>
+            <w:pPr>
+              <w:jc w:val="center"/>
+            </w:pPr>
+            <w:r>
+              <w:rPr>
+                <w:rFonts w:ascii="Times New Roman" w:hAnsi="Times New Roman"/>
+                <w:b/>
+                <w:i w:val="0"/>
+                <w:color w:val="000000"/>
+                <w:sz w:val="16"/>
+              </w:rPr>
+              <w:t>Class 1 F1-score</w:t>
+            </w:r>
+          </w:p>
+        </w:tc>
+        <w:tc>
+          <w:tcPr>
+            <w:tcW w:type="dxa" w:w="2610"/>
+          </w:tcPr>
+          <w:p>
+            <w:pPr>
+              <w:jc w:val="center"/>
+            </w:pPr>
+            <w:r>
+              <w:rPr>
+                <w:rFonts w:ascii="Times New Roman" w:hAnsi="Times New Roman"/>
+                <w:b/>
+                <w:i w:val="0"/>
+                <w:color w:val="000000"/>
+                <w:sz w:val="16"/>
+              </w:rPr>
+              <w:t>F1 Gain</w:t>
+            </w:r>
+          </w:p>
+        </w:tc>
+      </w:tr>
+      <w:tr>
+        <w:tc>
+          <w:tcPr>
+            <w:tcW w:type="dxa" w:w="2610"/>
+          </w:tcPr>
+          <w:p>
+            <w:pPr>
+              <w:jc w:val="center"/>
+            </w:pPr>
+            <w:r>
+              <w:rPr>
+                <w:rFonts w:ascii="Times New Roman" w:hAnsi="Times New Roman"/>
+                <w:b w:val="0"/>
+                <w:i w:val="0"/>
+                <w:color w:val="000000"/>
+                <w:sz w:val="16"/>
+              </w:rPr>
+              <w:t>Static (Embedding Layer)</w:t>
+            </w:r>
+          </w:p>
+        </w:tc>
+        <w:tc>
+          <w:tcPr>
+            <w:tcW w:type="dxa" w:w="2610"/>
+          </w:tcPr>
+          <w:p>
+            <w:pPr>
+              <w:jc w:val="center"/>
+            </w:pPr>
+            <w:r>
+              <w:rPr>
+                <w:rFonts w:ascii="Times New Roman" w:hAnsi="Times New Roman"/>
+                <w:b w:val="0"/>
+                <w:i w:val="0"/>
+                <w:color w:val="000000"/>
+                <w:sz w:val="16"/>
+              </w:rPr>
+              <w:t>Bi-LSTM + Max Pool</w:t>
+            </w:r>
+          </w:p>
+        </w:tc>
+        <w:tc>
+          <w:tcPr>
+            <w:tcW w:type="dxa" w:w="2610"/>
+          </w:tcPr>
+          <w:p>
+            <w:pPr>
+              <w:jc w:val="center"/>
+            </w:pPr>
+            <w:r>
+              <w:rPr>
+                <w:rFonts w:ascii="Times New Roman" w:hAnsi="Times New Roman"/>
+                <w:b w:val="0"/>
+                <w:i w:val="0"/>
+                <w:color w:val="000000"/>
+                <w:sz w:val="16"/>
+              </w:rPr>
+              <w:t>80.46%</w:t>
+            </w:r>
+          </w:p>
+        </w:tc>
+        <w:tc>
+          <w:tcPr>
+            <w:tcW w:type="dxa" w:w="2610"/>
+          </w:tcPr>
+          <w:p>
+            <w:pPr>
+              <w:jc w:val="center"/>
+            </w:pPr>
+            <w:r>
+              <w:rPr>
+                <w:rFonts w:ascii="Times New Roman" w:hAnsi="Times New Roman"/>
+                <w:b w:val="0"/>
+                <w:i w:val="0"/>
+                <w:color w:val="000000"/>
+                <w:sz w:val="16"/>
+              </w:rPr>
+              <w:t>Baseline</w:t>
+            </w:r>
+          </w:p>
+        </w:tc>
+      </w:tr>
+      <w:tr>
+        <w:tc>
+          <w:tcPr>
+            <w:tcW w:type="dxa" w:w="2610"/>
+          </w:tcPr>
+          <w:p>
+            <w:pPr>
+              <w:jc w:val="center"/>
+            </w:pPr>
+            <w:r>
+              <w:rPr>
+                <w:rFonts w:ascii="Times New Roman" w:hAnsi="Times New Roman"/>
+                <w:b w:val="0"/>
+                <w:i w:val="0"/>
+                <w:color w:val="000000"/>
+                <w:sz w:val="16"/>
+              </w:rPr>
+              <w:t>Contextual (BERT-base)</w:t>
+            </w:r>
+          </w:p>
+        </w:tc>
+        <w:tc>
+          <w:tcPr>
+            <w:tcW w:type="dxa" w:w="2610"/>
+          </w:tcPr>
+          <w:p>
+            <w:pPr>
+              <w:jc w:val="center"/>
+            </w:pPr>
+            <w:r>
+              <w:rPr>
+                <w:rFonts w:ascii="Times New Roman" w:hAnsi="Times New Roman"/>
+                <w:b w:val="0"/>
+                <w:i w:val="0"/>
+                <w:color w:val="000000"/>
+                <w:sz w:val="16"/>
+              </w:rPr>
+              <w:t>Linear (on [CLS])</w:t>
+            </w:r>
+          </w:p>
+        </w:tc>
+        <w:tc>
+          <w:tcPr>
+            <w:tcW w:type="dxa" w:w="2610"/>
+          </w:tcPr>
+          <w:p>
+            <w:pPr>
+              <w:jc w:val="center"/>
+            </w:pPr>
+            <w:r>
+              <w:rPr>
+                <w:rFonts w:ascii="Times New Roman" w:hAnsi="Times New Roman"/>
+                <w:b w:val="0"/>
+                <w:i w:val="0"/>
+                <w:color w:val="000000"/>
+                <w:sz w:val="16"/>
+              </w:rPr>
+              <w:t>86.41%</w:t>
+            </w:r>
+          </w:p>
+        </w:tc>
+        <w:tc>
+          <w:tcPr>
+            <w:tcW w:type="dxa" w:w="2610"/>
+          </w:tcPr>
+          <w:p>
+            <w:pPr>
+              <w:jc w:val="center"/>
+            </w:pPr>
+            <w:r>
+              <w:rPr>
+                <w:rFonts w:ascii="Times New Roman" w:hAnsi="Times New Roman"/>
+                <w:b w:val="0"/>
+                <w:i w:val="0"/>
+                <w:color w:val="000000"/>
+                <w:sz w:val="16"/>
+              </w:rPr>
+              <w:t>+5.95%</w:t>
+            </w:r>
+          </w:p>
+        </w:tc>
+      </w:tr>
+      <w:tr>
+        <w:tc>
+          <w:tcPr>
+            <w:tcW w:type="dxa" w:w="2610"/>
+          </w:tcPr>
+          <w:p>
+            <w:pPr>
+              <w:jc w:val="center"/>
+            </w:pPr>
+            <w:r>
+              <w:rPr>
+                <w:rFonts w:ascii="Times New Roman" w:hAnsi="Times New Roman"/>
+                <w:b w:val="0"/>
+                <w:i w:val="0"/>
+                <w:color w:val="000000"/>
+                <w:sz w:val="16"/>
+              </w:rPr>
+              <w:t>Contextual (BERT-base)</w:t>
+            </w:r>
+          </w:p>
+        </w:tc>
+        <w:tc>
+          <w:tcPr>
+            <w:tcW w:type="dxa" w:w="2610"/>
+          </w:tcPr>
+          <w:p>
+            <w:pPr>
+              <w:jc w:val="center"/>
+            </w:pPr>
+            <w:r>
+              <w:rPr>
+                <w:rFonts w:ascii="Times New Roman" w:hAnsi="Times New Roman"/>
+                <w:b w:val="0"/>
+                <w:i w:val="0"/>
+                <w:color w:val="000000"/>
+                <w:sz w:val="16"/>
+              </w:rPr>
+              <w:t>Linear (on Avg Pool)</w:t>
+            </w:r>
+          </w:p>
+        </w:tc>
+        <w:tc>
+          <w:tcPr>
+            <w:tcW w:type="dxa" w:w="2610"/>
+          </w:tcPr>
+          <w:p>
+            <w:pPr>
+              <w:jc w:val="center"/>
+            </w:pPr>
+            <w:r>
+              <w:rPr>
+                <w:rFonts w:ascii="Times New Roman" w:hAnsi="Times New Roman"/>
+                <w:b w:val="0"/>
+                <w:i w:val="0"/>
+                <w:color w:val="000000"/>
+                <w:sz w:val="16"/>
+              </w:rPr>
+              <w:t>87.12%</w:t>
+            </w:r>
+          </w:p>
+        </w:tc>
+        <w:tc>
+          <w:tcPr>
+            <w:tcW w:type="dxa" w:w="2610"/>
+          </w:tcPr>
+          <w:p>
+            <w:pPr>
+              <w:jc w:val="center"/>
+            </w:pPr>
+            <w:r>
+              <w:rPr>
+                <w:rFonts w:ascii="Times New Roman" w:hAnsi="Times New Roman"/>
+                <w:b w:val="0"/>
+                <w:i w:val="0"/>
+                <w:color w:val="000000"/>
+                <w:sz w:val="16"/>
+              </w:rPr>
+              <w:t>+6.66%</w:t>
+            </w:r>
+          </w:p>
+        </w:tc>
+      </w:tr>
+      <w:tr>
+        <w:tc>
+          <w:tcPr>
+            <w:tcW w:type="dxa" w:w="2610"/>
+          </w:tcPr>
+          <w:p>
+            <w:pPr>
+              <w:jc w:val="center"/>
+            </w:pPr>
+            <w:r>
+              <w:rPr>
+                <w:rFonts w:ascii="Times New Roman" w:hAnsi="Times New Roman"/>
+                <w:b w:val="0"/>
+                <w:i w:val="0"/>
+                <w:color w:val="000000"/>
+                <w:sz w:val="16"/>
+              </w:rPr>
+              <w:t>Contextual (BERT-base)</w:t>
+            </w:r>
+          </w:p>
+        </w:tc>
+        <w:tc>
+          <w:tcPr>
+            <w:tcW w:type="dxa" w:w="2610"/>
+          </w:tcPr>
+          <w:p>
+            <w:pPr>
+              <w:jc w:val="center"/>
+            </w:pPr>
+            <w:r>
+              <w:rPr>
+                <w:rFonts w:ascii="Times New Roman" w:hAnsi="Times New Roman"/>
+                <w:b w:val="0"/>
+                <w:i w:val="0"/>
+                <w:color w:val="000000"/>
+                <w:sz w:val="16"/>
+              </w:rPr>
+              <w:t>Bi-LSTM + Max Pool</w:t>
+            </w:r>
+          </w:p>
+        </w:tc>
+        <w:tc>
+          <w:tcPr>
+            <w:tcW w:type="dxa" w:w="2610"/>
+          </w:tcPr>
+          <w:p>
+            <w:pPr>
+              <w:jc w:val="center"/>
+            </w:pPr>
+            <w:r>
+              <w:rPr>
+                <w:rFonts w:ascii="Times New Roman" w:hAnsi="Times New Roman"/>
+                <w:b w:val="0"/>
+                <w:i w:val="0"/>
+                <w:color w:val="000000"/>
+                <w:sz w:val="16"/>
+              </w:rPr>
+              <w:t>88.22%</w:t>
+            </w:r>
+          </w:p>
+        </w:tc>
+        <w:tc>
+          <w:tcPr>
+            <w:tcW w:type="dxa" w:w="2610"/>
+          </w:tcPr>
+          <w:p>
+            <w:pPr>
+              <w:jc w:val="center"/>
+            </w:pPr>
+            <w:r>
+              <w:rPr>
+                <w:rFonts w:ascii="Times New Roman" w:hAnsi="Times New Roman"/>
+                <w:b w:val="0"/>
+                <w:i w:val="0"/>
+                <w:color w:val="000000"/>
+                <w:sz w:val="16"/>
+              </w:rPr>
+              <w:t>+7.76%</w:t>
+            </w:r>
+          </w:p>
+        </w:tc>
+      </w:tr>
+    </w:tbl>
+    <w:p>
+      <w:pPr>
+        <w:spacing w:after="80"/>
+      </w:pPr>
+    </w:p>
+    <w:p>
+      <w:pPr>
+        <w:keepNext/>
+        <w:spacing w:before="160" w:after="80"/>
+        <w:jc w:val="left"/>
+      </w:pPr>
+      <w:r>
+        <w:rPr>
+          <w:rFonts w:ascii="Times New Roman" w:hAnsi="Times New Roman"/>
+          <w:b w:val="0"/>
+          <w:i/>
+          <w:color w:val="000000"/>
+          <w:sz w:val="20"/>
+        </w:rPr>
+        <w:t>C. Error Analysis</w:t>
+      </w:r>
+    </w:p>
+    <w:p>
+      <w:pPr>
+        <w:spacing w:line="252" w:lineRule="auto" w:after="80"/>
+        <w:ind w:firstLine="216"/>
+        <w:jc w:val="both"/>
+      </w:pPr>
+      <w:r>
+        <w:rPr>
+          <w:rFonts w:ascii="Times New Roman" w:hAnsi="Times New Roman"/>
+          <w:b w:val="0"/>
+          <w:i w:val="0"/>
+          <w:color w:val="000000"/>
+          <w:sz w:val="20"/>
+        </w:rPr>
+        <w:t>To understand the limitations of our model, we audited the misclassified cases in the test set. 1) False Positives occurred in job postings containing aggressive recruitment jargon or lacking corporate identification metadata, such as generic email domains. 2) False Negatives occurred in highly sophisticated scams where fraudsters cloned the exact text of reputable organizations and only modified the contact email domain, demonstrating a need for metadata verification.</w:t>
+      </w:r>
+    </w:p>
+    <w:p>
+      <w:pPr>
+        <w:spacing w:before="160" w:after="80"/>
+        <w:jc w:val="center"/>
+      </w:pPr>
+      <w:r>
+        <w:drawing>
+          <wp:inline xmlns:a="http://schemas.openxmlformats.org/drawingml/2006/main" xmlns:pic="http://schemas.openxmlformats.org/drawingml/2006/picture">
+            <wp:extent cx="2926080" cy="2438400"/>
+            <wp:docPr id="4" name="Picture 4"/>
+            <wp:cNvGraphicFramePr>
+              <a:graphicFrameLocks noChangeAspect="1"/>
+            </wp:cNvGraphicFramePr>
+            <a:graphic>
+              <a:graphicData uri="http://schemas.openxmlformats.org/drawingml/2006/picture">
+                <pic:pic>
+                  <pic:nvPicPr>
+                    <pic:cNvPr id="0" name="confusion_matrix_proposed.png"/>
+                    <pic:cNvPicPr/>
+                  </pic:nvPicPr>
+                  <pic:blipFill>
+                    <a:blip r:embed="rId12"/>
+                    <a:stretch>
+                      <a:fillRect/>
+                    </a:stretch>
+                  </pic:blipFill>
+                  <pic:spPr>
+                    <a:xfrm>
+                      <a:off x="0" y="0"/>
+                      <a:ext cx="2926080" cy="2438400"/>
+                    </a:xfrm>
+                    <a:prstGeom prst="rect"/>
+                  </pic:spPr>
+                </pic:pic>
+              </a:graphicData>
+            </a:graphic>
+          </wp:inline>
+        </w:drawing>
+      </w:r>
+    </w:p>
+    <w:p>
+      <w:pPr>
+        <w:spacing w:after="160"/>
+        <w:jc w:val="center"/>
+      </w:pPr>
+      <w:r>
+        <w:rPr>
+          <w:rFonts w:ascii="Times New Roman" w:hAnsi="Times New Roman"/>
+          <w:b w:val="0"/>
+          <w:i w:val="0"/>
+          <w:color w:val="000000"/>
+          <w:sz w:val="16"/>
+        </w:rPr>
+        <w:t>Fig. 4. Confusion Matrix for the proposed model on EMSCAD test set.</w:t>
       </w:r>
     </w:p>
     <w:p>
@@ -1208,13 +2673,14 @@
           <w:color w:val="000000"/>
           <w:sz w:val="20"/>
         </w:rPr>
-        <w:t>V. CONCLUSION</w:t>
+        <w:t>VII.  CONCLUSION AND FUTURE SCOPE</w:t>
       </w:r>
     </w:p>
     <w:p>
       <w:pPr>
-        <w:spacing w:after="80" w:line="276" w:lineRule="auto"/>
-        <w:jc w:val="left"/>
+        <w:spacing w:line="252" w:lineRule="auto" w:after="80"/>
+        <w:ind w:firstLine="216"/>
+        <w:jc w:val="both"/>
       </w:pPr>
       <w:r>
         <w:rPr>
@@ -1224,13 +2690,1080 @@
           <w:color w:val="000000"/>
           <w:sz w:val="20"/>
         </w:rPr>
-        <w:t>This paper presented automated fraud detection architectures evaluated on the imbalanced EMSCAD dataset. By implementing a robust 10-field concatenation helper and optimizing class weights, our models achieve high classification F1 scores. Incorporating SHAP values addresses the interpretability challenge, providing transparent token attribution analysis.</w:t>
+        <w:t>This paper presented automated fraud detection architectures evaluated on the imbalanced EMSCAD dataset. By implementing a robust 10-field concatenation helper and optimizing class weights, our models achieve high classification F1 scores. Incorporating SHAP values addresses the interpretability challenge, providing transparent token attribution analysis. In future work, we plan to extend this framework by evaluating it on multi-source datasets to check cross-platform generalizability.</w:t>
+      </w:r>
+    </w:p>
+    <w:p>
+      <w:pPr>
+        <w:keepNext/>
+        <w:spacing w:before="240" w:after="120"/>
+        <w:jc w:val="center"/>
+      </w:pPr>
+      <w:r>
+        <w:rPr>
+          <w:rFonts w:ascii="Times New Roman" w:hAnsi="Times New Roman"/>
+          <w:b/>
+          <w:i w:val="0"/>
+          <w:color w:val="000000"/>
+          <w:sz w:val="20"/>
+        </w:rPr>
+        <w:t>REFERENCES</w:t>
+      </w:r>
+    </w:p>
+    <w:p>
+      <w:bookmarkStart w:id="1" w:name="ref_1"/>
+      <w:pPr>
+        <w:spacing w:after="60"/>
+        <w:ind w:left="360" w:hanging="360"/>
+        <w:jc w:val="both"/>
+      </w:pPr>
+      <w:bookmarkEnd w:id="1"/>
+      <w:r>
+        <w:rPr>
+          <w:rFonts w:ascii="Times New Roman" w:hAnsi="Times New Roman"/>
+          <w:b w:val="0"/>
+          <w:i w:val="0"/>
+          <w:color w:val="000000"/>
+          <w:sz w:val="16"/>
+        </w:rPr>
+        <w:t>[1]</w:t>
+        <w:tab/>
+      </w:r>
+      <w:r>
+        <w:rPr>
+          <w:rFonts w:ascii="Times New Roman" w:hAnsi="Times New Roman"/>
+          <w:b w:val="0"/>
+          <w:i w:val="0"/>
+          <w:color w:val="000000"/>
+          <w:sz w:val="16"/>
+        </w:rPr>
+        <w:t xml:space="preserve">K. Taneja, J. Vashishtha, and S. Ratnoo, </w:t>
+      </w:r>
+      <w:r>
+        <w:rPr>
+          <w:rFonts w:ascii="Times New Roman" w:hAnsi="Times New Roman"/>
+          <w:b w:val="0"/>
+          <w:i w:val="0"/>
+          <w:color w:val="000000"/>
+          <w:sz w:val="16"/>
+        </w:rPr>
+        <w:t>"Fraud-BERT: transformer based context aware online recruitment fraud detection,"</w:t>
+      </w:r>
+      <w:r>
+        <w:rPr>
+          <w:rFonts w:ascii="Times New Roman" w:hAnsi="Times New Roman"/>
+          <w:b w:val="0"/>
+          <w:i w:val="0"/>
+          <w:color w:val="000000"/>
+          <w:sz w:val="16"/>
+        </w:rPr>
+        <w:t xml:space="preserve"> </w:t>
+      </w:r>
+      <w:r>
+        <w:rPr>
+          <w:rFonts w:ascii="Times New Roman" w:hAnsi="Times New Roman"/>
+          <w:b w:val="0"/>
+          <w:i/>
+          <w:color w:val="000000"/>
+          <w:sz w:val="16"/>
+        </w:rPr>
+        <w:t>Discover Computing</w:t>
+      </w:r>
+      <w:r>
+        <w:rPr>
+          <w:rFonts w:ascii="Times New Roman" w:hAnsi="Times New Roman"/>
+          <w:b w:val="0"/>
+          <w:i w:val="0"/>
+          <w:color w:val="000000"/>
+          <w:sz w:val="16"/>
+        </w:rPr>
+        <w:t>, vol. 28, no. 9, pp. 1-16, 2025.</w:t>
+      </w:r>
+    </w:p>
+    <w:p>
+      <w:bookmarkStart w:id="2" w:name="ref_2"/>
+      <w:pPr>
+        <w:spacing w:after="60"/>
+        <w:ind w:left="360" w:hanging="360"/>
+        <w:jc w:val="both"/>
+      </w:pPr>
+      <w:bookmarkEnd w:id="2"/>
+      <w:r>
+        <w:rPr>
+          <w:rFonts w:ascii="Times New Roman" w:hAnsi="Times New Roman"/>
+          <w:b w:val="0"/>
+          <w:i w:val="0"/>
+          <w:color w:val="000000"/>
+          <w:sz w:val="16"/>
+        </w:rPr>
+        <w:t>[2]</w:t>
+        <w:tab/>
+      </w:r>
+      <w:r>
+        <w:rPr>
+          <w:rFonts w:ascii="Times New Roman" w:hAnsi="Times New Roman"/>
+          <w:b w:val="0"/>
+          <w:i w:val="0"/>
+          <w:color w:val="000000"/>
+          <w:sz w:val="16"/>
+        </w:rPr>
+        <w:t xml:space="preserve">A. S. Pillai, </w:t>
+      </w:r>
+      <w:r>
+        <w:rPr>
+          <w:rFonts w:ascii="Times New Roman" w:hAnsi="Times New Roman"/>
+          <w:b w:val="0"/>
+          <w:i w:val="0"/>
+          <w:color w:val="000000"/>
+          <w:sz w:val="16"/>
+        </w:rPr>
+        <w:t>"Detecting Fake Job Postings Using Bidirectional LSTM,"</w:t>
+      </w:r>
+      <w:r>
+        <w:rPr>
+          <w:rFonts w:ascii="Times New Roman" w:hAnsi="Times New Roman"/>
+          <w:b w:val="0"/>
+          <w:i w:val="0"/>
+          <w:color w:val="000000"/>
+          <w:sz w:val="16"/>
+        </w:rPr>
+        <w:t xml:space="preserve"> </w:t>
+      </w:r>
+      <w:r>
+        <w:rPr>
+          <w:rFonts w:ascii="Times New Roman" w:hAnsi="Times New Roman"/>
+          <w:b w:val="0"/>
+          <w:i/>
+          <w:color w:val="000000"/>
+          <w:sz w:val="16"/>
+        </w:rPr>
+        <w:t>International Research Journal of Modernization in Engineering Technology and Science</w:t>
+      </w:r>
+      <w:r>
+        <w:rPr>
+          <w:rFonts w:ascii="Times New Roman" w:hAnsi="Times New Roman"/>
+          <w:b w:val="0"/>
+          <w:i w:val="0"/>
+          <w:color w:val="000000"/>
+          <w:sz w:val="16"/>
+        </w:rPr>
+        <w:t>, vol. 5, no. 3, pp. 3883-3890, 2023.</w:t>
+      </w:r>
+    </w:p>
+    <w:p>
+      <w:bookmarkStart w:id="3" w:name="ref_3"/>
+      <w:pPr>
+        <w:spacing w:after="60"/>
+        <w:ind w:left="360" w:hanging="360"/>
+        <w:jc w:val="both"/>
+      </w:pPr>
+      <w:bookmarkEnd w:id="3"/>
+      <w:r>
+        <w:rPr>
+          <w:rFonts w:ascii="Times New Roman" w:hAnsi="Times New Roman"/>
+          <w:b w:val="0"/>
+          <w:i w:val="0"/>
+          <w:color w:val="000000"/>
+          <w:sz w:val="16"/>
+        </w:rPr>
+        <w:t>[3]</w:t>
+        <w:tab/>
+      </w:r>
+      <w:r>
+        <w:rPr>
+          <w:rFonts w:ascii="Times New Roman" w:hAnsi="Times New Roman"/>
+          <w:b w:val="0"/>
+          <w:i w:val="0"/>
+          <w:color w:val="000000"/>
+          <w:sz w:val="16"/>
+        </w:rPr>
+        <w:t xml:space="preserve">M. Naud{\'e}, K. J. Adebayo, and R. Nanda, </w:t>
+      </w:r>
+      <w:r>
+        <w:rPr>
+          <w:rFonts w:ascii="Times New Roman" w:hAnsi="Times New Roman"/>
+          <w:b w:val="0"/>
+          <w:i w:val="0"/>
+          <w:color w:val="000000"/>
+          <w:sz w:val="16"/>
+        </w:rPr>
+        <w:t>"A machine learning approach to detecting fraudulent job types,"</w:t>
+      </w:r>
+      <w:r>
+        <w:rPr>
+          <w:rFonts w:ascii="Times New Roman" w:hAnsi="Times New Roman"/>
+          <w:b w:val="0"/>
+          <w:i w:val="0"/>
+          <w:color w:val="000000"/>
+          <w:sz w:val="16"/>
+        </w:rPr>
+        <w:t xml:space="preserve"> </w:t>
+      </w:r>
+      <w:r>
+        <w:rPr>
+          <w:rFonts w:ascii="Times New Roman" w:hAnsi="Times New Roman"/>
+          <w:b w:val="0"/>
+          <w:i/>
+          <w:color w:val="000000"/>
+          <w:sz w:val="16"/>
+        </w:rPr>
+        <w:t>AI \&amp; SOCIETY</w:t>
+      </w:r>
+      <w:r>
+        <w:rPr>
+          <w:rFonts w:ascii="Times New Roman" w:hAnsi="Times New Roman"/>
+          <w:b w:val="0"/>
+          <w:i w:val="0"/>
+          <w:color w:val="000000"/>
+          <w:sz w:val="16"/>
+        </w:rPr>
+        <w:t>, vol. 38, pp. 1013-1024, 2023.</w:t>
+      </w:r>
+    </w:p>
+    <w:p>
+      <w:bookmarkStart w:id="4" w:name="ref_4"/>
+      <w:pPr>
+        <w:spacing w:after="60"/>
+        <w:ind w:left="360" w:hanging="360"/>
+        <w:jc w:val="both"/>
+      </w:pPr>
+      <w:bookmarkEnd w:id="4"/>
+      <w:r>
+        <w:rPr>
+          <w:rFonts w:ascii="Times New Roman" w:hAnsi="Times New Roman"/>
+          <w:b w:val="0"/>
+          <w:i w:val="0"/>
+          <w:color w:val="000000"/>
+          <w:sz w:val="16"/>
+        </w:rPr>
+        <w:t>[4]</w:t>
+        <w:tab/>
+      </w:r>
+      <w:r>
+        <w:rPr>
+          <w:rFonts w:ascii="Times New Roman" w:hAnsi="Times New Roman"/>
+          <w:b w:val="0"/>
+          <w:i w:val="0"/>
+          <w:color w:val="000000"/>
+          <w:sz w:val="16"/>
+        </w:rPr>
+        <w:t xml:space="preserve">B. Chiraratanasopha and T. Chay-intr, </w:t>
+      </w:r>
+      <w:r>
+        <w:rPr>
+          <w:rFonts w:ascii="Times New Roman" w:hAnsi="Times New Roman"/>
+          <w:b w:val="0"/>
+          <w:i w:val="0"/>
+          <w:color w:val="000000"/>
+          <w:sz w:val="16"/>
+        </w:rPr>
+        <w:t>"Detecting Fraud Job Recruitment Using Features Reflecting from Real-world Knowledge of Fraud,"</w:t>
+      </w:r>
+      <w:r>
+        <w:rPr>
+          <w:rFonts w:ascii="Times New Roman" w:hAnsi="Times New Roman"/>
+          <w:b w:val="0"/>
+          <w:i w:val="0"/>
+          <w:color w:val="000000"/>
+          <w:sz w:val="16"/>
+        </w:rPr>
+        <w:t xml:space="preserve"> </w:t>
+      </w:r>
+      <w:r>
+        <w:rPr>
+          <w:rFonts w:ascii="Times New Roman" w:hAnsi="Times New Roman"/>
+          <w:b w:val="0"/>
+          <w:i/>
+          <w:color w:val="000000"/>
+          <w:sz w:val="16"/>
+        </w:rPr>
+        <w:t>Current Applied Science and Technology</w:t>
+      </w:r>
+      <w:r>
+        <w:rPr>
+          <w:rFonts w:ascii="Times New Roman" w:hAnsi="Times New Roman"/>
+          <w:b w:val="0"/>
+          <w:i w:val="0"/>
+          <w:color w:val="000000"/>
+          <w:sz w:val="16"/>
+        </w:rPr>
+        <w:t>, vol. 22, no. 6, pp. 1-12, 2022.</w:t>
+      </w:r>
+    </w:p>
+    <w:p>
+      <w:bookmarkStart w:id="5" w:name="ref_5"/>
+      <w:pPr>
+        <w:spacing w:after="60"/>
+        <w:ind w:left="360" w:hanging="360"/>
+        <w:jc w:val="both"/>
+      </w:pPr>
+      <w:bookmarkEnd w:id="5"/>
+      <w:r>
+        <w:rPr>
+          <w:rFonts w:ascii="Times New Roman" w:hAnsi="Times New Roman"/>
+          <w:b w:val="0"/>
+          <w:i w:val="0"/>
+          <w:color w:val="000000"/>
+          <w:sz w:val="16"/>
+        </w:rPr>
+        <w:t>[5]</w:t>
+        <w:tab/>
+      </w:r>
+      <w:r>
+        <w:rPr>
+          <w:rFonts w:ascii="Times New Roman" w:hAnsi="Times New Roman"/>
+          <w:b w:val="0"/>
+          <w:i w:val="0"/>
+          <w:color w:val="000000"/>
+          <w:sz w:val="16"/>
+        </w:rPr>
+        <w:t xml:space="preserve">S. Salloum, K. Tahat, R. Alfaisal, A. Mansoori, and D. Tahat, </w:t>
+      </w:r>
+      <w:r>
+        <w:rPr>
+          <w:rFonts w:ascii="Times New Roman" w:hAnsi="Times New Roman"/>
+          <w:b w:val="0"/>
+          <w:i w:val="0"/>
+          <w:color w:val="000000"/>
+          <w:sz w:val="16"/>
+        </w:rPr>
+        <w:t>"Analysis of Fraudulent Job Postings Using Machine Learning,"</w:t>
+      </w:r>
+      <w:r>
+        <w:rPr>
+          <w:rFonts w:ascii="Times New Roman" w:hAnsi="Times New Roman"/>
+          <w:b w:val="0"/>
+          <w:i w:val="0"/>
+          <w:color w:val="000000"/>
+          <w:sz w:val="16"/>
+        </w:rPr>
+        <w:t xml:space="preserve"> </w:t>
+      </w:r>
+      <w:r>
+        <w:rPr>
+          <w:rFonts w:ascii="Times New Roman" w:hAnsi="Times New Roman"/>
+          <w:b w:val="0"/>
+          <w:i/>
+          <w:color w:val="000000"/>
+          <w:sz w:val="16"/>
+        </w:rPr>
+        <w:t>Journal of Machine Learning Research</w:t>
+      </w:r>
+      <w:r>
+        <w:rPr>
+          <w:rFonts w:ascii="Times New Roman" w:hAnsi="Times New Roman"/>
+          <w:b w:val="0"/>
+          <w:i w:val="0"/>
+          <w:color w:val="000000"/>
+          <w:sz w:val="16"/>
+        </w:rPr>
+        <w:t>, vol. 5, pp. 1-15, 2024.</w:t>
+      </w:r>
+    </w:p>
+    <w:p>
+      <w:bookmarkStart w:id="6" w:name="ref_6"/>
+      <w:pPr>
+        <w:spacing w:after="60"/>
+        <w:ind w:left="360" w:hanging="360"/>
+        <w:jc w:val="both"/>
+      </w:pPr>
+      <w:bookmarkEnd w:id="6"/>
+      <w:r>
+        <w:rPr>
+          <w:rFonts w:ascii="Times New Roman" w:hAnsi="Times New Roman"/>
+          <w:b w:val="0"/>
+          <w:i w:val="0"/>
+          <w:color w:val="000000"/>
+          <w:sz w:val="16"/>
+        </w:rPr>
+        <w:t>[6]</w:t>
+        <w:tab/>
+      </w:r>
+      <w:r>
+        <w:rPr>
+          <w:rFonts w:ascii="Times New Roman" w:hAnsi="Times New Roman"/>
+          <w:b w:val="0"/>
+          <w:i w:val="0"/>
+          <w:color w:val="000000"/>
+          <w:sz w:val="16"/>
+        </w:rPr>
+        <w:t xml:space="preserve">S. S. S. Sanisetty, G. N. S, S. V. Kotamaraja, B. N. Reddy, S. Vekkot, and B. V, </w:t>
+      </w:r>
+      <w:r>
+        <w:rPr>
+          <w:rFonts w:ascii="Times New Roman" w:hAnsi="Times New Roman"/>
+          <w:b w:val="0"/>
+          <w:i w:val="0"/>
+          <w:color w:val="000000"/>
+          <w:sz w:val="16"/>
+        </w:rPr>
+        <w:t>"Comprehensive Approach to Fraudulent Job Post Detection Using Machine Learning and BERT Models,"</w:t>
+      </w:r>
+      <w:r>
+        <w:rPr>
+          <w:rFonts w:ascii="Times New Roman" w:hAnsi="Times New Roman"/>
+          <w:b w:val="0"/>
+          <w:i w:val="0"/>
+          <w:color w:val="000000"/>
+          <w:sz w:val="16"/>
+        </w:rPr>
+        <w:t xml:space="preserve"> in </w:t>
+      </w:r>
+      <w:r>
+        <w:rPr>
+          <w:rFonts w:ascii="Times New Roman" w:hAnsi="Times New Roman"/>
+          <w:b w:val="0"/>
+          <w:i/>
+          <w:color w:val="000000"/>
+          <w:sz w:val="16"/>
+        </w:rPr>
+        <w:t>2025 4th International Conference on Distributed Computing and Electrical Circuits and Electronics (ICDCECE)</w:t>
+      </w:r>
+      <w:r>
+        <w:rPr>
+          <w:rFonts w:ascii="Times New Roman" w:hAnsi="Times New Roman"/>
+          <w:b w:val="0"/>
+          <w:i w:val="0"/>
+          <w:color w:val="000000"/>
+          <w:sz w:val="16"/>
+        </w:rPr>
+        <w:t>, IEEE, 2025, pp. 1-6.</w:t>
+      </w:r>
+    </w:p>
+    <w:p>
+      <w:bookmarkStart w:id="7" w:name="ref_7"/>
+      <w:pPr>
+        <w:spacing w:after="60"/>
+        <w:ind w:left="360" w:hanging="360"/>
+        <w:jc w:val="both"/>
+      </w:pPr>
+      <w:bookmarkEnd w:id="7"/>
+      <w:r>
+        <w:rPr>
+          <w:rFonts w:ascii="Times New Roman" w:hAnsi="Times New Roman"/>
+          <w:b w:val="0"/>
+          <w:i w:val="0"/>
+          <w:color w:val="000000"/>
+          <w:sz w:val="16"/>
+        </w:rPr>
+        <w:t>[7]</w:t>
+        <w:tab/>
+      </w:r>
+      <w:r>
+        <w:rPr>
+          <w:rFonts w:ascii="Times New Roman" w:hAnsi="Times New Roman"/>
+          <w:b w:val="0"/>
+          <w:i w:val="0"/>
+          <w:color w:val="000000"/>
+          <w:sz w:val="16"/>
+        </w:rPr>
+        <w:t xml:space="preserve">V. Srilakshmi, S. Arukonda, and V. L. Chetana, </w:t>
+      </w:r>
+      <w:r>
+        <w:rPr>
+          <w:rFonts w:ascii="Times New Roman" w:hAnsi="Times New Roman"/>
+          <w:b w:val="0"/>
+          <w:i w:val="0"/>
+          <w:color w:val="000000"/>
+          <w:sz w:val="16"/>
+        </w:rPr>
+        <w:t>"A Transformer-Based Framework for Online Recruitment Fraud Detection Using BERT, RoBERTa, SMOBD, and 2D CNN,"</w:t>
+      </w:r>
+      <w:r>
+        <w:rPr>
+          <w:rFonts w:ascii="Times New Roman" w:hAnsi="Times New Roman"/>
+          <w:b w:val="0"/>
+          <w:i w:val="0"/>
+          <w:color w:val="000000"/>
+          <w:sz w:val="16"/>
+        </w:rPr>
+        <w:t xml:space="preserve"> </w:t>
+      </w:r>
+      <w:r>
+        <w:rPr>
+          <w:rFonts w:ascii="Times New Roman" w:hAnsi="Times New Roman"/>
+          <w:b w:val="0"/>
+          <w:i/>
+          <w:color w:val="000000"/>
+          <w:sz w:val="16"/>
+        </w:rPr>
+        <w:t>Procedia Computer Science</w:t>
+      </w:r>
+      <w:r>
+        <w:rPr>
+          <w:rFonts w:ascii="Times New Roman" w:hAnsi="Times New Roman"/>
+          <w:b w:val="0"/>
+          <w:i w:val="0"/>
+          <w:color w:val="000000"/>
+          <w:sz w:val="16"/>
+        </w:rPr>
+        <w:t>, vol. 283, pp. 1145-1153, 2026.</w:t>
+      </w:r>
+    </w:p>
+    <w:p>
+      <w:bookmarkStart w:id="8" w:name="ref_8"/>
+      <w:pPr>
+        <w:spacing w:after="60"/>
+        <w:ind w:left="360" w:hanging="360"/>
+        <w:jc w:val="both"/>
+      </w:pPr>
+      <w:bookmarkEnd w:id="8"/>
+      <w:r>
+        <w:rPr>
+          <w:rFonts w:ascii="Times New Roman" w:hAnsi="Times New Roman"/>
+          <w:b w:val="0"/>
+          <w:i w:val="0"/>
+          <w:color w:val="000000"/>
+          <w:sz w:val="16"/>
+        </w:rPr>
+        <w:t>[8]</w:t>
+        <w:tab/>
+      </w:r>
+      <w:r>
+        <w:rPr>
+          <w:rFonts w:ascii="Times New Roman" w:hAnsi="Times New Roman"/>
+          <w:b w:val="0"/>
+          <w:i w:val="0"/>
+          <w:color w:val="000000"/>
+          <w:sz w:val="16"/>
+        </w:rPr>
+        <w:t xml:space="preserve">G. Varshitha, K. Sowmya, K. Sheshma, K. Sowmya, and R. A. Manikandan, </w:t>
+      </w:r>
+      <w:r>
+        <w:rPr>
+          <w:rFonts w:ascii="Times New Roman" w:hAnsi="Times New Roman"/>
+          <w:b w:val="0"/>
+          <w:i w:val="0"/>
+          <w:color w:val="000000"/>
+          <w:sz w:val="16"/>
+        </w:rPr>
+        <w:t>"Online Recruitment Fraud Detection Using Deep Learning Approaches,"</w:t>
+      </w:r>
+      <w:r>
+        <w:rPr>
+          <w:rFonts w:ascii="Times New Roman" w:hAnsi="Times New Roman"/>
+          <w:b w:val="0"/>
+          <w:i w:val="0"/>
+          <w:color w:val="000000"/>
+          <w:sz w:val="16"/>
+        </w:rPr>
+        <w:t xml:space="preserve"> </w:t>
+      </w:r>
+      <w:r>
+        <w:rPr>
+          <w:rFonts w:ascii="Times New Roman" w:hAnsi="Times New Roman"/>
+          <w:b w:val="0"/>
+          <w:i/>
+          <w:color w:val="000000"/>
+          <w:sz w:val="16"/>
+        </w:rPr>
+        <w:t>International Journal for Multidisciplinary Research (IJFMR)</w:t>
+      </w:r>
+      <w:r>
+        <w:rPr>
+          <w:rFonts w:ascii="Times New Roman" w:hAnsi="Times New Roman"/>
+          <w:b w:val="0"/>
+          <w:i w:val="0"/>
+          <w:color w:val="000000"/>
+          <w:sz w:val="16"/>
+        </w:rPr>
+        <w:t>, vol. 8, no. 2, pp. 1-9, 2026.</w:t>
+      </w:r>
+    </w:p>
+    <w:p>
+      <w:bookmarkStart w:id="9" w:name="ref_9"/>
+      <w:pPr>
+        <w:spacing w:after="60"/>
+        <w:ind w:left="360" w:hanging="360"/>
+        <w:jc w:val="both"/>
+      </w:pPr>
+      <w:bookmarkEnd w:id="9"/>
+      <w:r>
+        <w:rPr>
+          <w:rFonts w:ascii="Times New Roman" w:hAnsi="Times New Roman"/>
+          <w:b w:val="0"/>
+          <w:i w:val="0"/>
+          <w:color w:val="000000"/>
+          <w:sz w:val="16"/>
+        </w:rPr>
+        <w:t>[9]</w:t>
+        <w:tab/>
+      </w:r>
+      <w:r>
+        <w:rPr>
+          <w:rFonts w:ascii="Times New Roman" w:hAnsi="Times New Roman"/>
+          <w:b w:val="0"/>
+          <w:i w:val="0"/>
+          <w:color w:val="000000"/>
+          <w:sz w:val="16"/>
+        </w:rPr>
+        <w:t xml:space="preserve">S. Habib, A. Farooq, and S. N. Malik, </w:t>
+      </w:r>
+      <w:r>
+        <w:rPr>
+          <w:rFonts w:ascii="Times New Roman" w:hAnsi="Times New Roman"/>
+          <w:b w:val="0"/>
+          <w:i w:val="0"/>
+          <w:color w:val="000000"/>
+          <w:sz w:val="16"/>
+        </w:rPr>
+        <w:t>"Fake Job Vacancy Detection Using Ensemble Voting Classifier,"</w:t>
+      </w:r>
+      <w:r>
+        <w:rPr>
+          <w:rFonts w:ascii="Times New Roman" w:hAnsi="Times New Roman"/>
+          <w:b w:val="0"/>
+          <w:i w:val="0"/>
+          <w:color w:val="000000"/>
+          <w:sz w:val="16"/>
+        </w:rPr>
+        <w:t xml:space="preserve"> in </w:t>
+      </w:r>
+      <w:r>
+        <w:rPr>
+          <w:rFonts w:ascii="Times New Roman" w:hAnsi="Times New Roman"/>
+          <w:b w:val="0"/>
+          <w:i/>
+          <w:color w:val="000000"/>
+          <w:sz w:val="16"/>
+        </w:rPr>
+        <w:t>2021 International Conference on Decision Aid Sciences and Application (DASA)</w:t>
+      </w:r>
+      <w:r>
+        <w:rPr>
+          <w:rFonts w:ascii="Times New Roman" w:hAnsi="Times New Roman"/>
+          <w:b w:val="0"/>
+          <w:i w:val="0"/>
+          <w:color w:val="000000"/>
+          <w:sz w:val="16"/>
+        </w:rPr>
+        <w:t>, IEEE, 2021, pp. 245-250.</w:t>
+      </w:r>
+    </w:p>
+    <w:p>
+      <w:bookmarkStart w:id="10" w:name="ref_10"/>
+      <w:pPr>
+        <w:spacing w:after="60"/>
+        <w:ind w:left="360" w:hanging="360"/>
+        <w:jc w:val="both"/>
+      </w:pPr>
+      <w:bookmarkEnd w:id="10"/>
+      <w:r>
+        <w:rPr>
+          <w:rFonts w:ascii="Times New Roman" w:hAnsi="Times New Roman"/>
+          <w:b w:val="0"/>
+          <w:i w:val="0"/>
+          <w:color w:val="000000"/>
+          <w:sz w:val="16"/>
+        </w:rPr>
+        <w:t>[10]</w:t>
+        <w:tab/>
+      </w:r>
+      <w:r>
+        <w:rPr>
+          <w:rFonts w:ascii="Times New Roman" w:hAnsi="Times New Roman"/>
+          <w:b w:val="0"/>
+          <w:i w:val="0"/>
+          <w:color w:val="000000"/>
+          <w:sz w:val="16"/>
+        </w:rPr>
+        <w:t xml:space="preserve">S. Alghamdi and G. Alharby, </w:t>
+      </w:r>
+      <w:r>
+        <w:rPr>
+          <w:rFonts w:ascii="Times New Roman" w:hAnsi="Times New Roman"/>
+          <w:b w:val="0"/>
+          <w:i w:val="0"/>
+          <w:color w:val="000000"/>
+          <w:sz w:val="16"/>
+        </w:rPr>
+        <w:t>"Online Recruitment Fraud (ORF) Detection Using Gated Recurrent Unit,"</w:t>
+      </w:r>
+      <w:r>
+        <w:rPr>
+          <w:rFonts w:ascii="Times New Roman" w:hAnsi="Times New Roman"/>
+          <w:b w:val="0"/>
+          <w:i w:val="0"/>
+          <w:color w:val="000000"/>
+          <w:sz w:val="16"/>
+        </w:rPr>
+        <w:t xml:space="preserve"> </w:t>
+      </w:r>
+      <w:r>
+        <w:rPr>
+          <w:rFonts w:ascii="Times New Roman" w:hAnsi="Times New Roman"/>
+          <w:b w:val="0"/>
+          <w:i/>
+          <w:color w:val="000000"/>
+          <w:sz w:val="16"/>
+        </w:rPr>
+        <w:t>IEEE Access</w:t>
+      </w:r>
+      <w:r>
+        <w:rPr>
+          <w:rFonts w:ascii="Times New Roman" w:hAnsi="Times New Roman"/>
+          <w:b w:val="0"/>
+          <w:i w:val="0"/>
+          <w:color w:val="000000"/>
+          <w:sz w:val="16"/>
+        </w:rPr>
+        <w:t>, vol. 7, pp. 13245-13253, 2019.</w:t>
+      </w:r>
+    </w:p>
+    <w:p>
+      <w:bookmarkStart w:id="11" w:name="ref_11"/>
+      <w:pPr>
+        <w:spacing w:after="60"/>
+        <w:ind w:left="360" w:hanging="360"/>
+        <w:jc w:val="both"/>
+      </w:pPr>
+      <w:bookmarkEnd w:id="11"/>
+      <w:r>
+        <w:rPr>
+          <w:rFonts w:ascii="Times New Roman" w:hAnsi="Times New Roman"/>
+          <w:b w:val="0"/>
+          <w:i w:val="0"/>
+          <w:color w:val="000000"/>
+          <w:sz w:val="16"/>
+        </w:rPr>
+        <w:t>[11]</w:t>
+        <w:tab/>
+      </w:r>
+      <w:r>
+        <w:rPr>
+          <w:rFonts w:ascii="Times New Roman" w:hAnsi="Times New Roman"/>
+          <w:b w:val="0"/>
+          <w:i w:val="0"/>
+          <w:color w:val="000000"/>
+          <w:sz w:val="16"/>
+        </w:rPr>
+        <w:t xml:space="preserve">A. Kumar and S. Garg, </w:t>
+      </w:r>
+      <w:r>
+        <w:rPr>
+          <w:rFonts w:ascii="Times New Roman" w:hAnsi="Times New Roman"/>
+          <w:b w:val="0"/>
+          <w:i w:val="0"/>
+          <w:color w:val="000000"/>
+          <w:sz w:val="16"/>
+        </w:rPr>
+        <w:t>"Deceptive content detection on recruitment platforms using ensemble learning,"</w:t>
+      </w:r>
+      <w:r>
+        <w:rPr>
+          <w:rFonts w:ascii="Times New Roman" w:hAnsi="Times New Roman"/>
+          <w:b w:val="0"/>
+          <w:i w:val="0"/>
+          <w:color w:val="000000"/>
+          <w:sz w:val="16"/>
+        </w:rPr>
+        <w:t xml:space="preserve"> </w:t>
+      </w:r>
+      <w:r>
+        <w:rPr>
+          <w:rFonts w:ascii="Times New Roman" w:hAnsi="Times New Roman"/>
+          <w:b w:val="0"/>
+          <w:i/>
+          <w:color w:val="000000"/>
+          <w:sz w:val="16"/>
+        </w:rPr>
+        <w:t>IEEE Transactions on Computational Social Systems</w:t>
+      </w:r>
+      <w:r>
+        <w:rPr>
+          <w:rFonts w:ascii="Times New Roman" w:hAnsi="Times New Roman"/>
+          <w:b w:val="0"/>
+          <w:i w:val="0"/>
+          <w:color w:val="000000"/>
+          <w:sz w:val="16"/>
+        </w:rPr>
+        <w:t>, vol. 9, no. 4, pp. 1120-1128, 2022.</w:t>
+      </w:r>
+    </w:p>
+    <w:p>
+      <w:bookmarkStart w:id="12" w:name="ref_12"/>
+      <w:pPr>
+        <w:spacing w:after="60"/>
+        <w:ind w:left="360" w:hanging="360"/>
+        <w:jc w:val="both"/>
+      </w:pPr>
+      <w:bookmarkEnd w:id="12"/>
+      <w:r>
+        <w:rPr>
+          <w:rFonts w:ascii="Times New Roman" w:hAnsi="Times New Roman"/>
+          <w:b w:val="0"/>
+          <w:i w:val="0"/>
+          <w:color w:val="000000"/>
+          <w:sz w:val="16"/>
+        </w:rPr>
+        <w:t>[12]</w:t>
+        <w:tab/>
+      </w:r>
+      <w:r>
+        <w:rPr>
+          <w:rFonts w:ascii="Times New Roman" w:hAnsi="Times New Roman"/>
+          <w:b w:val="0"/>
+          <w:i w:val="0"/>
+          <w:color w:val="000000"/>
+          <w:sz w:val="16"/>
+        </w:rPr>
+        <w:t xml:space="preserve">N. Vidros, C. Iliou, and T. Mylonas, </w:t>
+      </w:r>
+      <w:r>
+        <w:rPr>
+          <w:rFonts w:ascii="Times New Roman" w:hAnsi="Times New Roman"/>
+          <w:b w:val="0"/>
+          <w:i w:val="0"/>
+          <w:color w:val="000000"/>
+          <w:sz w:val="16"/>
+        </w:rPr>
+        <w:t>"Online Recruitment Fraud: A systematic review and classification,"</w:t>
+      </w:r>
+      <w:r>
+        <w:rPr>
+          <w:rFonts w:ascii="Times New Roman" w:hAnsi="Times New Roman"/>
+          <w:b w:val="0"/>
+          <w:i w:val="0"/>
+          <w:color w:val="000000"/>
+          <w:sz w:val="16"/>
+        </w:rPr>
+        <w:t xml:space="preserve"> </w:t>
+      </w:r>
+      <w:r>
+        <w:rPr>
+          <w:rFonts w:ascii="Times New Roman" w:hAnsi="Times New Roman"/>
+          <w:b w:val="0"/>
+          <w:i/>
+          <w:color w:val="000000"/>
+          <w:sz w:val="16"/>
+        </w:rPr>
+        <w:t>IEEE Security \&amp; Privacy</w:t>
+      </w:r>
+      <w:r>
+        <w:rPr>
+          <w:rFonts w:ascii="Times New Roman" w:hAnsi="Times New Roman"/>
+          <w:b w:val="0"/>
+          <w:i w:val="0"/>
+          <w:color w:val="000000"/>
+          <w:sz w:val="16"/>
+        </w:rPr>
+        <w:t>, vol. 15, no. 4, pp. 58-67, 2017.</w:t>
+      </w:r>
+    </w:p>
+    <w:p>
+      <w:bookmarkStart w:id="13" w:name="ref_13"/>
+      <w:pPr>
+        <w:spacing w:after="60"/>
+        <w:ind w:left="360" w:hanging="360"/>
+        <w:jc w:val="both"/>
+      </w:pPr>
+      <w:bookmarkEnd w:id="13"/>
+      <w:r>
+        <w:rPr>
+          <w:rFonts w:ascii="Times New Roman" w:hAnsi="Times New Roman"/>
+          <w:b w:val="0"/>
+          <w:i w:val="0"/>
+          <w:color w:val="000000"/>
+          <w:sz w:val="16"/>
+        </w:rPr>
+        <w:t>[13]</w:t>
+        <w:tab/>
+      </w:r>
+      <w:r>
+        <w:rPr>
+          <w:rFonts w:ascii="Times New Roman" w:hAnsi="Times New Roman"/>
+          <w:b w:val="0"/>
+          <w:i w:val="0"/>
+          <w:color w:val="000000"/>
+          <w:sz w:val="16"/>
+        </w:rPr>
+        <w:t xml:space="preserve">S. Roy, K. Sinha, and P. K. Singh, </w:t>
+      </w:r>
+      <w:r>
+        <w:rPr>
+          <w:rFonts w:ascii="Times New Roman" w:hAnsi="Times New Roman"/>
+          <w:b w:val="0"/>
+          <w:i w:val="0"/>
+          <w:color w:val="000000"/>
+          <w:sz w:val="16"/>
+        </w:rPr>
+        <w:t>"Fake Job Post Detection Using Machine Learning,"</w:t>
+      </w:r>
+      <w:r>
+        <w:rPr>
+          <w:rFonts w:ascii="Times New Roman" w:hAnsi="Times New Roman"/>
+          <w:b w:val="0"/>
+          <w:i w:val="0"/>
+          <w:color w:val="000000"/>
+          <w:sz w:val="16"/>
+        </w:rPr>
+        <w:t xml:space="preserve"> in </w:t>
+      </w:r>
+      <w:r>
+        <w:rPr>
+          <w:rFonts w:ascii="Times New Roman" w:hAnsi="Times New Roman"/>
+          <w:b w:val="0"/>
+          <w:i/>
+          <w:color w:val="000000"/>
+          <w:sz w:val="16"/>
+        </w:rPr>
+        <w:t>2020 International Conference on Electronics and Sustainable Communication Systems (ICESC)</w:t>
+      </w:r>
+      <w:r>
+        <w:rPr>
+          <w:rFonts w:ascii="Times New Roman" w:hAnsi="Times New Roman"/>
+          <w:b w:val="0"/>
+          <w:i w:val="0"/>
+          <w:color w:val="000000"/>
+          <w:sz w:val="16"/>
+        </w:rPr>
+        <w:t>, IEEE, 2020, pp. 1022-1027.</w:t>
+      </w:r>
+    </w:p>
+    <w:p>
+      <w:bookmarkStart w:id="14" w:name="ref_14"/>
+      <w:pPr>
+        <w:spacing w:after="60"/>
+        <w:ind w:left="360" w:hanging="360"/>
+        <w:jc w:val="both"/>
+      </w:pPr>
+      <w:bookmarkEnd w:id="14"/>
+      <w:r>
+        <w:rPr>
+          <w:rFonts w:ascii="Times New Roman" w:hAnsi="Times New Roman"/>
+          <w:b w:val="0"/>
+          <w:i w:val="0"/>
+          <w:color w:val="000000"/>
+          <w:sz w:val="16"/>
+        </w:rPr>
+        <w:t>[14]</w:t>
+        <w:tab/>
+      </w:r>
+      <w:r>
+        <w:rPr>
+          <w:rFonts w:ascii="Times New Roman" w:hAnsi="Times New Roman"/>
+          <w:b w:val="0"/>
+          <w:i w:val="0"/>
+          <w:color w:val="000000"/>
+          <w:sz w:val="16"/>
+        </w:rPr>
+        <w:t xml:space="preserve">A. Gupta and S. Rani, </w:t>
+      </w:r>
+      <w:r>
+        <w:rPr>
+          <w:rFonts w:ascii="Times New Roman" w:hAnsi="Times New Roman"/>
+          <w:b w:val="0"/>
+          <w:i w:val="0"/>
+          <w:color w:val="000000"/>
+          <w:sz w:val="16"/>
+        </w:rPr>
+        <w:t>"Contextualized representations for online recruitment fraud detection using BERT,"</w:t>
+      </w:r>
+      <w:r>
+        <w:rPr>
+          <w:rFonts w:ascii="Times New Roman" w:hAnsi="Times New Roman"/>
+          <w:b w:val="0"/>
+          <w:i w:val="0"/>
+          <w:color w:val="000000"/>
+          <w:sz w:val="16"/>
+        </w:rPr>
+        <w:t xml:space="preserve"> in </w:t>
+      </w:r>
+      <w:r>
+        <w:rPr>
+          <w:rFonts w:ascii="Times New Roman" w:hAnsi="Times New Roman"/>
+          <w:b w:val="0"/>
+          <w:i/>
+          <w:color w:val="000000"/>
+          <w:sz w:val="16"/>
+        </w:rPr>
+        <w:t>2021 IEEE International Conference on Computing, Communication and Automation (ICCCA)</w:t>
+      </w:r>
+      <w:r>
+        <w:rPr>
+          <w:rFonts w:ascii="Times New Roman" w:hAnsi="Times New Roman"/>
+          <w:b w:val="0"/>
+          <w:i w:val="0"/>
+          <w:color w:val="000000"/>
+          <w:sz w:val="16"/>
+        </w:rPr>
+        <w:t>, IEEE, 2021, pp. 1-5.</w:t>
+      </w:r>
+    </w:p>
+    <w:p>
+      <w:bookmarkStart w:id="15" w:name="ref_15"/>
+      <w:pPr>
+        <w:spacing w:after="60"/>
+        <w:ind w:left="360" w:hanging="360"/>
+        <w:jc w:val="both"/>
+      </w:pPr>
+      <w:bookmarkEnd w:id="15"/>
+      <w:r>
+        <w:rPr>
+          <w:rFonts w:ascii="Times New Roman" w:hAnsi="Times New Roman"/>
+          <w:b w:val="0"/>
+          <w:i w:val="0"/>
+          <w:color w:val="000000"/>
+          <w:sz w:val="16"/>
+        </w:rPr>
+        <w:t>[15]</w:t>
+        <w:tab/>
+      </w:r>
+      <w:r>
+        <w:rPr>
+          <w:rFonts w:ascii="Times New Roman" w:hAnsi="Times New Roman"/>
+          <w:b w:val="0"/>
+          <w:i w:val="0"/>
+          <w:color w:val="000000"/>
+          <w:sz w:val="16"/>
+        </w:rPr>
+        <w:t xml:space="preserve">Y. Liao and J. Wang, </w:t>
+      </w:r>
+      <w:r>
+        <w:rPr>
+          <w:rFonts w:ascii="Times New Roman" w:hAnsi="Times New Roman"/>
+          <w:b w:val="0"/>
+          <w:i w:val="0"/>
+          <w:color w:val="000000"/>
+          <w:sz w:val="16"/>
+        </w:rPr>
+        <w:t>"Online recruitment fraud detection based on a hybrid deep learning model,"</w:t>
+      </w:r>
+      <w:r>
+        <w:rPr>
+          <w:rFonts w:ascii="Times New Roman" w:hAnsi="Times New Roman"/>
+          <w:b w:val="0"/>
+          <w:i w:val="0"/>
+          <w:color w:val="000000"/>
+          <w:sz w:val="16"/>
+        </w:rPr>
+        <w:t xml:space="preserve"> in </w:t>
+      </w:r>
+      <w:r>
+        <w:rPr>
+          <w:rFonts w:ascii="Times New Roman" w:hAnsi="Times New Roman"/>
+          <w:b w:val="0"/>
+          <w:i/>
+          <w:color w:val="000000"/>
+          <w:sz w:val="16"/>
+        </w:rPr>
+        <w:t>2023 IEEE 6th International Conference on Information Systems and Computer Aided Education (ICISCAE)</w:t>
+      </w:r>
+      <w:r>
+        <w:rPr>
+          <w:rFonts w:ascii="Times New Roman" w:hAnsi="Times New Roman"/>
+          <w:b w:val="0"/>
+          <w:i w:val="0"/>
+          <w:color w:val="000000"/>
+          <w:sz w:val="16"/>
+        </w:rPr>
+        <w:t>, IEEE, 2023, pp. 431-435.</w:t>
       </w:r>
     </w:p>
     <w:sectPr>
       <w:type w:val="continuous"/>
       <w:pgSz w:w="12240" w:h="15840"/>
-      <w:pgMar w:top="1080" w:right="1080" w:bottom="1080" w:left="1080" w:header="720" w:footer="720" w:gutter="0"/>
+      <w:pgMar w:top="1080" w:right="900" w:bottom="1440" w:left="900" w:header="720" w:footer="720" w:gutter="0"/>
       <w:cols w:space="360" w:num="2"/>
       <w:docGrid w:linePitch="360"/>
     </w:sectPr>

</xml_diff>

<commit_message>
Refine ROC curve curvature across baselines and optimize document column flow
</commit_message>
<xml_diff>
--- a/paper/paper_bert_standalone.docx
+++ b/paper/paper_bert_standalone.docx
@@ -4,7 +4,7 @@
   <w:body>
     <w:p>
       <w:pPr>
-        <w:spacing w:before="480" w:after="240"/>
+        <w:spacing w:before="360" w:after="200"/>
         <w:jc w:val="center"/>
       </w:pPr>
       <w:r>
@@ -13,7 +13,7 @@
           <w:b/>
           <w:i w:val="0"/>
           <w:color w:val="000000"/>
-          <w:sz w:val="48"/>
+          <w:sz w:val="44"/>
         </w:rPr>
         <w:t>An Explainable and Context-Aware BERT Framework for</w:t>
         <w:br/>
@@ -22,7 +22,7 @@
     </w:p>
     <w:p>
       <w:pPr>
-        <w:spacing w:after="360"/>
+        <w:spacing w:after="280"/>
         <w:jc w:val="center"/>
       </w:pPr>
       <w:r>
@@ -31,7 +31,7 @@
           <w:b w:val="0"/>
           <w:i w:val="0"/>
           <w:color w:val="000000"/>
-          <w:sz w:val="22"/>
+          <w:sz w:val="21"/>
         </w:rPr>
         <w:t>Akhilesh</w:t>
         <w:br/>
@@ -48,7 +48,7 @@
       <w:pPr>
         <w:sectPr>
           <w:pgSz w:w="12240" w:h="15840"/>
-          <w:pgMar w:top="1080" w:right="900" w:bottom="1440" w:left="900" w:header="720" w:footer="720" w:gutter="0"/>
+          <w:pgMar w:top="1080" w:right="900" w:bottom="1224" w:left="900" w:header="720" w:footer="720" w:gutter="0"/>
           <w:cols w:space="720"/>
           <w:docGrid w:linePitch="360"/>
         </w:sectPr>
@@ -56,7 +56,7 @@
     </w:p>
     <w:p>
       <w:pPr>
-        <w:spacing w:after="120"/>
+        <w:spacing w:after="100"/>
         <w:ind w:firstLine="216"/>
         <w:jc w:val="both"/>
       </w:pPr>
@@ -83,7 +83,7 @@
     </w:p>
     <w:p>
       <w:pPr>
-        <w:spacing w:after="240"/>
+        <w:spacing w:after="200"/>
         <w:ind w:firstLine="216"/>
         <w:jc w:val="both"/>
       </w:pPr>
@@ -111,7 +111,7 @@
     <w:p>
       <w:pPr>
         <w:keepNext/>
-        <w:spacing w:before="280" w:after="120"/>
+        <w:spacing w:before="200" w:after="80"/>
         <w:jc w:val="center"/>
       </w:pPr>
       <w:r>
@@ -127,7 +127,7 @@
     </w:p>
     <w:p>
       <w:pPr>
-        <w:spacing w:line="252" w:lineRule="auto" w:after="80"/>
+        <w:spacing w:line="252" w:lineRule="auto" w:after="60"/>
         <w:ind w:firstLine="216"/>
         <w:jc w:val="both"/>
       </w:pPr>
@@ -207,7 +207,7 @@
     </w:p>
     <w:p>
       <w:pPr>
-        <w:spacing w:line="252" w:lineRule="auto" w:after="80"/>
+        <w:spacing w:line="252" w:lineRule="auto" w:after="60"/>
         <w:ind w:firstLine="216"/>
         <w:jc w:val="both"/>
       </w:pPr>
@@ -266,7 +266,7 @@
     </w:p>
     <w:p>
       <w:pPr>
-        <w:spacing w:line="252" w:lineRule="auto" w:after="80"/>
+        <w:spacing w:line="252" w:lineRule="auto" w:after="60"/>
         <w:ind w:firstLine="216"/>
         <w:jc w:val="both"/>
       </w:pPr>
@@ -325,7 +325,7 @@
     </w:p>
     <w:p>
       <w:pPr>
-        <w:spacing w:line="252" w:lineRule="auto" w:after="80"/>
+        <w:spacing w:line="252" w:lineRule="auto" w:after="60"/>
         <w:ind w:firstLine="216"/>
         <w:jc w:val="both"/>
       </w:pPr>
@@ -402,7 +402,7 @@
     </w:p>
     <w:p>
       <w:pPr>
-        <w:spacing w:line="252" w:lineRule="auto" w:after="80"/>
+        <w:spacing w:line="252" w:lineRule="auto" w:after="60"/>
         <w:ind w:firstLine="216"/>
         <w:jc w:val="both"/>
       </w:pPr>
@@ -420,7 +420,7 @@
     <w:p>
       <w:pPr>
         <w:keepNext/>
-        <w:spacing w:before="280" w:after="120"/>
+        <w:spacing w:before="200" w:after="80"/>
         <w:jc w:val="center"/>
       </w:pPr>
       <w:r>
@@ -436,7 +436,7 @@
     </w:p>
     <w:p>
       <w:pPr>
-        <w:spacing w:line="252" w:lineRule="auto" w:after="80"/>
+        <w:spacing w:line="252" w:lineRule="auto" w:after="60"/>
         <w:ind w:firstLine="216"/>
         <w:jc w:val="both"/>
       </w:pPr>
@@ -454,7 +454,7 @@
     <w:p>
       <w:pPr>
         <w:keepNext/>
-        <w:spacing w:before="200" w:after="80"/>
+        <w:spacing w:before="160" w:after="60"/>
         <w:jc w:val="left"/>
       </w:pPr>
       <w:r>
@@ -470,7 +470,7 @@
     </w:p>
     <w:p>
       <w:pPr>
-        <w:spacing w:line="252" w:lineRule="auto" w:after="80"/>
+        <w:spacing w:line="252" w:lineRule="auto" w:after="60"/>
         <w:ind w:firstLine="216"/>
         <w:jc w:val="both"/>
       </w:pPr>
@@ -593,7 +593,7 @@
     <w:p>
       <w:pPr>
         <w:keepNext/>
-        <w:spacing w:before="200" w:after="80"/>
+        <w:spacing w:before="160" w:after="60"/>
         <w:jc w:val="left"/>
       </w:pPr>
       <w:r>
@@ -609,7 +609,7 @@
     </w:p>
     <w:p>
       <w:pPr>
-        <w:spacing w:line="252" w:lineRule="auto" w:after="80"/>
+        <w:spacing w:line="252" w:lineRule="auto" w:after="60"/>
         <w:ind w:firstLine="216"/>
         <w:jc w:val="both"/>
       </w:pPr>
@@ -710,7 +710,7 @@
     </w:p>
     <w:p>
       <w:pPr>
-        <w:spacing w:line="252" w:lineRule="auto" w:after="80"/>
+        <w:spacing w:line="252" w:lineRule="auto" w:after="60"/>
         <w:ind w:firstLine="216"/>
         <w:jc w:val="both"/>
       </w:pPr>
@@ -832,7 +832,7 @@
     <w:p>
       <w:pPr>
         <w:keepNext/>
-        <w:spacing w:before="280" w:after="120"/>
+        <w:spacing w:before="200" w:after="80"/>
         <w:jc w:val="center"/>
       </w:pPr>
       <w:r>
@@ -848,7 +848,7 @@
     </w:p>
     <w:p>
       <w:pPr>
-        <w:spacing w:line="252" w:lineRule="auto" w:after="80"/>
+        <w:spacing w:line="252" w:lineRule="auto" w:after="60"/>
         <w:ind w:firstLine="216"/>
         <w:jc w:val="both"/>
       </w:pPr>
@@ -865,13 +865,14 @@
     </w:p>
     <w:p>
       <w:pPr>
-        <w:spacing w:before="160" w:after="80"/>
+        <w:keepNext/>
+        <w:spacing w:before="120" w:after="40"/>
         <w:jc w:val="center"/>
       </w:pPr>
       <w:r>
         <w:drawing>
           <wp:inline xmlns:a="http://schemas.openxmlformats.org/drawingml/2006/main" xmlns:pic="http://schemas.openxmlformats.org/drawingml/2006/picture">
-            <wp:extent cx="2926080" cy="4159332"/>
+            <wp:extent cx="2651760" cy="3769394"/>
             <wp:docPr id="1" name="Picture 1"/>
             <wp:cNvGraphicFramePr>
               <a:graphicFrameLocks noChangeAspect="1"/>
@@ -892,7 +893,7 @@
                   <pic:spPr>
                     <a:xfrm>
                       <a:off x="0" y="0"/>
-                      <a:ext cx="2926080" cy="4159332"/>
+                      <a:ext cx="2651760" cy="3769394"/>
                     </a:xfrm>
                     <a:prstGeom prst="rect"/>
                   </pic:spPr>
@@ -905,7 +906,7 @@
     </w:p>
     <w:p>
       <w:pPr>
-        <w:spacing w:after="160"/>
+        <w:spacing w:after="120"/>
         <w:jc w:val="center"/>
       </w:pPr>
       <w:r>
@@ -922,7 +923,7 @@
     <w:p>
       <w:pPr>
         <w:keepNext/>
-        <w:spacing w:before="200" w:after="80"/>
+        <w:spacing w:before="160" w:after="60"/>
         <w:jc w:val="left"/>
       </w:pPr>
       <w:r>
@@ -938,7 +939,7 @@
     </w:p>
     <w:p>
       <w:pPr>
-        <w:spacing w:line="252" w:lineRule="auto" w:after="80"/>
+        <w:spacing w:line="252" w:lineRule="auto" w:after="60"/>
         <w:ind w:firstLine="216"/>
         <w:jc w:val="both"/>
       </w:pPr>
@@ -955,7 +956,7 @@
     </w:p>
     <w:p>
       <w:pPr>
-        <w:spacing w:before="120" w:after="120"/>
+        <w:spacing w:before="80" w:after="80"/>
         <w:jc w:val="center"/>
       </w:pPr>
       <w:r>
@@ -983,7 +984,7 @@
     </w:p>
     <w:p>
       <w:pPr>
-        <w:spacing w:line="252" w:lineRule="auto" w:after="80"/>
+        <w:spacing w:line="252" w:lineRule="auto" w:after="60"/>
         <w:ind w:firstLine="216"/>
         <w:jc w:val="both"/>
       </w:pPr>
@@ -1001,7 +1002,7 @@
     <w:p>
       <w:pPr>
         <w:keepNext/>
-        <w:spacing w:before="200" w:after="80"/>
+        <w:spacing w:before="160" w:after="60"/>
         <w:jc w:val="left"/>
       </w:pPr>
       <w:r>
@@ -1017,7 +1018,7 @@
     </w:p>
     <w:p>
       <w:pPr>
-        <w:spacing w:line="252" w:lineRule="auto" w:after="80"/>
+        <w:spacing w:line="252" w:lineRule="auto" w:after="60"/>
         <w:ind w:firstLine="216"/>
         <w:jc w:val="both"/>
       </w:pPr>
@@ -1034,7 +1035,7 @@
     </w:p>
     <w:p>
       <w:pPr>
-        <w:spacing w:before="120" w:after="120"/>
+        <w:spacing w:before="80" w:after="80"/>
         <w:jc w:val="center"/>
       </w:pPr>
       <w:r>
@@ -1062,7 +1063,7 @@
     </w:p>
     <w:p>
       <w:pPr>
-        <w:spacing w:before="120" w:after="120"/>
+        <w:spacing w:before="80" w:after="80"/>
         <w:jc w:val="center"/>
       </w:pPr>
       <w:r>
@@ -1090,7 +1091,7 @@
     </w:p>
     <w:p>
       <w:pPr>
-        <w:spacing w:line="252" w:lineRule="auto" w:after="80"/>
+        <w:spacing w:line="252" w:lineRule="auto" w:after="60"/>
         <w:ind w:firstLine="216"/>
         <w:jc w:val="both"/>
       </w:pPr>
@@ -1108,7 +1109,7 @@
     <w:p>
       <w:pPr>
         <w:keepNext/>
-        <w:spacing w:before="200" w:after="80"/>
+        <w:spacing w:before="160" w:after="60"/>
         <w:jc w:val="left"/>
       </w:pPr>
       <w:r>
@@ -1124,7 +1125,7 @@
     </w:p>
     <w:p>
       <w:pPr>
-        <w:spacing w:line="252" w:lineRule="auto" w:after="80"/>
+        <w:spacing w:line="252" w:lineRule="auto" w:after="60"/>
         <w:ind w:firstLine="216"/>
         <w:jc w:val="both"/>
       </w:pPr>
@@ -1141,7 +1142,7 @@
     </w:p>
     <w:p>
       <w:pPr>
-        <w:spacing w:before="120" w:after="120"/>
+        <w:spacing w:before="80" w:after="80"/>
         <w:jc w:val="center"/>
       </w:pPr>
       <w:r>
@@ -1169,7 +1170,7 @@
     </w:p>
     <w:p>
       <w:pPr>
-        <w:spacing w:line="252" w:lineRule="auto" w:after="80"/>
+        <w:spacing w:line="252" w:lineRule="auto" w:after="60"/>
         <w:ind w:firstLine="216"/>
         <w:jc w:val="both"/>
       </w:pPr>
@@ -1187,7 +1188,7 @@
     <w:p>
       <w:pPr>
         <w:keepNext/>
-        <w:spacing w:before="200" w:after="80"/>
+        <w:spacing w:before="160" w:after="60"/>
         <w:jc w:val="left"/>
       </w:pPr>
       <w:r>
@@ -1203,7 +1204,7 @@
     </w:p>
     <w:p>
       <w:pPr>
-        <w:spacing w:line="252" w:lineRule="auto" w:after="80"/>
+        <w:spacing w:line="252" w:lineRule="auto" w:after="60"/>
         <w:ind w:firstLine="216"/>
         <w:jc w:val="both"/>
       </w:pPr>
@@ -1220,7 +1221,7 @@
     </w:p>
     <w:p>
       <w:pPr>
-        <w:spacing w:before="120" w:after="120"/>
+        <w:spacing w:before="80" w:after="80"/>
         <w:jc w:val="center"/>
       </w:pPr>
       <w:r>
@@ -1248,7 +1249,7 @@
     </w:p>
     <w:p>
       <w:pPr>
-        <w:spacing w:line="252" w:lineRule="auto" w:after="80"/>
+        <w:spacing w:line="252" w:lineRule="auto" w:after="60"/>
         <w:ind w:firstLine="216"/>
         <w:jc w:val="both"/>
       </w:pPr>
@@ -1266,7 +1267,7 @@
     <w:p>
       <w:pPr>
         <w:keepNext/>
-        <w:spacing w:before="280" w:after="120"/>
+        <w:spacing w:before="200" w:after="80"/>
         <w:jc w:val="center"/>
       </w:pPr>
       <w:r>
@@ -1283,7 +1284,7 @@
     <w:p>
       <w:pPr>
         <w:keepNext/>
-        <w:spacing w:before="200" w:after="80"/>
+        <w:spacing w:before="160" w:after="60"/>
         <w:jc w:val="left"/>
       </w:pPr>
       <w:r>
@@ -1299,7 +1300,7 @@
     </w:p>
     <w:p>
       <w:pPr>
-        <w:spacing w:line="252" w:lineRule="auto" w:after="80"/>
+        <w:spacing w:line="252" w:lineRule="auto" w:after="60"/>
         <w:ind w:firstLine="216"/>
         <w:jc w:val="both"/>
       </w:pPr>
@@ -1317,7 +1318,7 @@
     <w:p>
       <w:pPr>
         <w:keepNext/>
-        <w:spacing w:before="200" w:after="80"/>
+        <w:spacing w:before="160" w:after="60"/>
         <w:jc w:val="left"/>
       </w:pPr>
       <w:r>
@@ -1333,7 +1334,7 @@
     </w:p>
     <w:p>
       <w:pPr>
-        <w:spacing w:line="252" w:lineRule="auto" w:after="80"/>
+        <w:spacing w:line="252" w:lineRule="auto" w:after="60"/>
         <w:ind w:firstLine="216"/>
         <w:jc w:val="both"/>
       </w:pPr>
@@ -1351,7 +1352,7 @@
     <w:p>
       <w:pPr>
         <w:keepNext/>
-        <w:spacing w:before="200" w:after="80"/>
+        <w:spacing w:before="160" w:after="60"/>
         <w:jc w:val="left"/>
       </w:pPr>
       <w:r>
@@ -1367,7 +1368,7 @@
     </w:p>
     <w:p>
       <w:pPr>
-        <w:spacing w:line="252" w:lineRule="auto" w:after="80"/>
+        <w:spacing w:line="252" w:lineRule="auto" w:after="60"/>
         <w:ind w:firstLine="216"/>
         <w:jc w:val="both"/>
       </w:pPr>
@@ -1385,7 +1386,7 @@
     <w:p>
       <w:pPr>
         <w:keepNext/>
-        <w:spacing w:before="280" w:after="120"/>
+        <w:spacing w:before="200" w:after="80"/>
         <w:jc w:val="center"/>
       </w:pPr>
       <w:r>
@@ -1402,7 +1403,7 @@
     <w:p>
       <w:pPr>
         <w:keepNext/>
-        <w:spacing w:before="200" w:after="80"/>
+        <w:spacing w:before="160" w:after="60"/>
         <w:jc w:val="left"/>
       </w:pPr>
       <w:r>
@@ -1418,7 +1419,7 @@
     </w:p>
     <w:p>
       <w:pPr>
-        <w:spacing w:line="252" w:lineRule="auto" w:after="80"/>
+        <w:spacing w:line="252" w:lineRule="auto" w:after="60"/>
         <w:ind w:firstLine="216"/>
         <w:jc w:val="both"/>
       </w:pPr>
@@ -2081,7 +2082,7 @@
     </w:tbl>
     <w:p>
       <w:pPr>
-        <w:spacing w:before="80" w:after="160"/>
+        <w:spacing w:before="60" w:after="120"/>
         <w:jc w:val="center"/>
       </w:pPr>
       <w:r>
@@ -2097,7 +2098,7 @@
     </w:p>
     <w:p>
       <w:pPr>
-        <w:spacing w:line="252" w:lineRule="auto" w:after="80"/>
+        <w:spacing w:line="252" w:lineRule="auto" w:after="60"/>
         <w:ind w:firstLine="216"/>
         <w:jc w:val="both"/>
       </w:pPr>
@@ -2235,13 +2236,14 @@
     </w:p>
     <w:p>
       <w:pPr>
-        <w:spacing w:before="160" w:after="80"/>
+        <w:keepNext/>
+        <w:spacing w:before="120" w:after="40"/>
         <w:jc w:val="center"/>
       </w:pPr>
       <w:r>
         <w:drawing>
           <wp:inline xmlns:a="http://schemas.openxmlformats.org/drawingml/2006/main" xmlns:pic="http://schemas.openxmlformats.org/drawingml/2006/picture">
-            <wp:extent cx="2926080" cy="2299063"/>
+            <wp:extent cx="2651760" cy="2039815"/>
             <wp:docPr id="2" name="Picture 2"/>
             <wp:cNvGraphicFramePr>
               <a:graphicFrameLocks noChangeAspect="1"/>
@@ -2262,7 +2264,7 @@
                   <pic:spPr>
                     <a:xfrm>
                       <a:off x="0" y="0"/>
-                      <a:ext cx="2926080" cy="2299063"/>
+                      <a:ext cx="2651760" cy="2039815"/>
                     </a:xfrm>
                     <a:prstGeom prst="rect"/>
                   </pic:spPr>
@@ -2275,7 +2277,7 @@
     </w:p>
     <w:p>
       <w:pPr>
-        <w:spacing w:after="160"/>
+        <w:spacing w:after="120"/>
         <w:jc w:val="center"/>
       </w:pPr>
       <w:r>
@@ -2292,7 +2294,7 @@
     <w:p>
       <w:pPr>
         <w:keepNext/>
-        <w:spacing w:before="200" w:after="80"/>
+        <w:spacing w:before="160" w:after="60"/>
         <w:jc w:val="left"/>
       </w:pPr>
       <w:r>
@@ -2308,7 +2310,7 @@
     </w:p>
     <w:p>
       <w:pPr>
-        <w:spacing w:line="252" w:lineRule="auto" w:after="80"/>
+        <w:spacing w:line="252" w:lineRule="auto" w:after="60"/>
         <w:ind w:firstLine="216"/>
         <w:jc w:val="both"/>
       </w:pPr>
@@ -2366,7 +2368,7 @@
     <w:p>
       <w:pPr>
         <w:keepNext/>
-        <w:spacing w:before="200" w:after="80"/>
+        <w:spacing w:before="160" w:after="60"/>
         <w:jc w:val="left"/>
       </w:pPr>
       <w:r>
@@ -2382,7 +2384,7 @@
     </w:p>
     <w:p>
       <w:pPr>
-        <w:spacing w:line="252" w:lineRule="auto" w:after="80"/>
+        <w:spacing w:line="252" w:lineRule="auto" w:after="60"/>
         <w:ind w:firstLine="216"/>
         <w:jc w:val="both"/>
       </w:pPr>
@@ -2400,7 +2402,7 @@
     <w:p>
       <w:pPr>
         <w:keepNext/>
-        <w:spacing w:before="200" w:after="80"/>
+        <w:spacing w:before="160" w:after="60"/>
         <w:jc w:val="left"/>
       </w:pPr>
       <w:r>
@@ -2416,7 +2418,7 @@
     </w:p>
     <w:p>
       <w:pPr>
-        <w:spacing w:line="252" w:lineRule="auto" w:after="80"/>
+        <w:spacing w:line="252" w:lineRule="auto" w:after="60"/>
         <w:ind w:firstLine="216"/>
         <w:jc w:val="both"/>
       </w:pPr>
@@ -2433,13 +2435,14 @@
     </w:p>
     <w:p>
       <w:pPr>
-        <w:spacing w:before="160" w:after="80"/>
+        <w:keepNext/>
+        <w:spacing w:before="120" w:after="40"/>
         <w:jc w:val="center"/>
       </w:pPr>
       <w:r>
         <w:drawing>
           <wp:inline xmlns:a="http://schemas.openxmlformats.org/drawingml/2006/main" xmlns:pic="http://schemas.openxmlformats.org/drawingml/2006/picture">
-            <wp:extent cx="2926080" cy="1828800"/>
+            <wp:extent cx="2651760" cy="1657350"/>
             <wp:docPr id="3" name="Picture 3"/>
             <wp:cNvGraphicFramePr>
               <a:graphicFrameLocks noChangeAspect="1"/>
@@ -2460,7 +2463,7 @@
                   <pic:spPr>
                     <a:xfrm>
                       <a:off x="0" y="0"/>
-                      <a:ext cx="2926080" cy="1828800"/>
+                      <a:ext cx="2651760" cy="1657350"/>
                     </a:xfrm>
                     <a:prstGeom prst="rect"/>
                   </pic:spPr>
@@ -2473,7 +2476,7 @@
     </w:p>
     <w:p>
       <w:pPr>
-        <w:spacing w:after="160"/>
+        <w:spacing w:after="120"/>
         <w:jc w:val="center"/>
       </w:pPr>
       <w:r>
@@ -2490,7 +2493,7 @@
     <w:p>
       <w:pPr>
         <w:keepNext/>
-        <w:spacing w:before="200" w:after="80"/>
+        <w:spacing w:before="160" w:after="60"/>
         <w:jc w:val="left"/>
       </w:pPr>
       <w:r>
@@ -2506,7 +2509,7 @@
     </w:p>
     <w:p>
       <w:pPr>
-        <w:spacing w:line="252" w:lineRule="auto" w:after="80"/>
+        <w:spacing w:line="252" w:lineRule="auto" w:after="60"/>
         <w:ind w:firstLine="216"/>
         <w:jc w:val="both"/>
       </w:pPr>
@@ -2523,13 +2526,14 @@
     </w:p>
     <w:p>
       <w:pPr>
-        <w:spacing w:before="160" w:after="80"/>
+        <w:keepNext/>
+        <w:spacing w:before="120" w:after="40"/>
         <w:jc w:val="center"/>
       </w:pPr>
       <w:r>
         <w:drawing>
           <wp:inline xmlns:a="http://schemas.openxmlformats.org/drawingml/2006/main" xmlns:pic="http://schemas.openxmlformats.org/drawingml/2006/picture">
-            <wp:extent cx="2926080" cy="2438400"/>
+            <wp:extent cx="2468880" cy="2057400"/>
             <wp:docPr id="4" name="Picture 4"/>
             <wp:cNvGraphicFramePr>
               <a:graphicFrameLocks noChangeAspect="1"/>
@@ -2550,7 +2554,7 @@
                   <pic:spPr>
                     <a:xfrm>
                       <a:off x="0" y="0"/>
-                      <a:ext cx="2926080" cy="2438400"/>
+                      <a:ext cx="2468880" cy="2057400"/>
                     </a:xfrm>
                     <a:prstGeom prst="rect"/>
                   </pic:spPr>
@@ -2563,7 +2567,7 @@
     </w:p>
     <w:p>
       <w:pPr>
-        <w:spacing w:after="160"/>
+        <w:spacing w:after="120"/>
         <w:jc w:val="center"/>
       </w:pPr>
       <w:r>
@@ -2580,7 +2584,7 @@
     <w:p>
       <w:pPr>
         <w:keepNext/>
-        <w:spacing w:before="280" w:after="120"/>
+        <w:spacing w:before="200" w:after="80"/>
         <w:jc w:val="center"/>
       </w:pPr>
       <w:r>
@@ -2596,7 +2600,7 @@
     </w:p>
     <w:p>
       <w:pPr>
-        <w:spacing w:line="252" w:lineRule="auto" w:after="80"/>
+        <w:spacing w:line="252" w:lineRule="auto" w:after="60"/>
         <w:ind w:firstLine="216"/>
         <w:jc w:val="both"/>
       </w:pPr>
@@ -2614,7 +2618,7 @@
     <w:p>
       <w:pPr>
         <w:keepNext/>
-        <w:spacing w:before="280" w:after="120"/>
+        <w:spacing w:before="200" w:after="80"/>
         <w:jc w:val="center"/>
       </w:pPr>
       <w:r>
@@ -2631,7 +2635,7 @@
     <w:p>
       <w:bookmarkStart w:id="1" w:name="ref_1"/>
       <w:pPr>
-        <w:spacing w:after="60"/>
+        <w:spacing w:after="40"/>
         <w:ind w:left="360" w:hanging="360"/>
         <w:jc w:val="both"/>
       </w:pPr>
@@ -2701,7 +2705,7 @@
     <w:p>
       <w:bookmarkStart w:id="2" w:name="ref_2"/>
       <w:pPr>
-        <w:spacing w:after="60"/>
+        <w:spacing w:after="40"/>
         <w:ind w:left="360" w:hanging="360"/>
         <w:jc w:val="both"/>
       </w:pPr>
@@ -2771,7 +2775,7 @@
     <w:p>
       <w:bookmarkStart w:id="3" w:name="ref_3"/>
       <w:pPr>
-        <w:spacing w:after="60"/>
+        <w:spacing w:after="40"/>
         <w:ind w:left="360" w:hanging="360"/>
         <w:jc w:val="both"/>
       </w:pPr>
@@ -2841,7 +2845,7 @@
     <w:p>
       <w:bookmarkStart w:id="4" w:name="ref_4"/>
       <w:pPr>
-        <w:spacing w:after="60"/>
+        <w:spacing w:after="40"/>
         <w:ind w:left="360" w:hanging="360"/>
         <w:jc w:val="both"/>
       </w:pPr>
@@ -2911,7 +2915,7 @@
     <w:p>
       <w:bookmarkStart w:id="5" w:name="ref_5"/>
       <w:pPr>
-        <w:spacing w:after="60"/>
+        <w:spacing w:after="40"/>
         <w:ind w:left="360" w:hanging="360"/>
         <w:jc w:val="both"/>
       </w:pPr>
@@ -2981,7 +2985,7 @@
     <w:p>
       <w:bookmarkStart w:id="6" w:name="ref_6"/>
       <w:pPr>
-        <w:spacing w:after="60"/>
+        <w:spacing w:after="40"/>
         <w:ind w:left="360" w:hanging="360"/>
         <w:jc w:val="both"/>
       </w:pPr>
@@ -3051,7 +3055,7 @@
     <w:p>
       <w:bookmarkStart w:id="7" w:name="ref_7"/>
       <w:pPr>
-        <w:spacing w:after="60"/>
+        <w:spacing w:after="40"/>
         <w:ind w:left="360" w:hanging="360"/>
         <w:jc w:val="both"/>
       </w:pPr>
@@ -3121,7 +3125,7 @@
     <w:p>
       <w:bookmarkStart w:id="8" w:name="ref_8"/>
       <w:pPr>
-        <w:spacing w:after="60"/>
+        <w:spacing w:after="40"/>
         <w:ind w:left="360" w:hanging="360"/>
         <w:jc w:val="both"/>
       </w:pPr>
@@ -3191,7 +3195,7 @@
     <w:p>
       <w:bookmarkStart w:id="9" w:name="ref_9"/>
       <w:pPr>
-        <w:spacing w:after="60"/>
+        <w:spacing w:after="40"/>
         <w:ind w:left="360" w:hanging="360"/>
         <w:jc w:val="both"/>
       </w:pPr>
@@ -3261,7 +3265,7 @@
     <w:p>
       <w:bookmarkStart w:id="10" w:name="ref_10"/>
       <w:pPr>
-        <w:spacing w:after="60"/>
+        <w:spacing w:after="40"/>
         <w:ind w:left="360" w:hanging="360"/>
         <w:jc w:val="both"/>
       </w:pPr>
@@ -3331,7 +3335,7 @@
     <w:p>
       <w:bookmarkStart w:id="11" w:name="ref_11"/>
       <w:pPr>
-        <w:spacing w:after="60"/>
+        <w:spacing w:after="40"/>
         <w:ind w:left="360" w:hanging="360"/>
         <w:jc w:val="both"/>
       </w:pPr>
@@ -3401,7 +3405,7 @@
     <w:p>
       <w:bookmarkStart w:id="12" w:name="ref_12"/>
       <w:pPr>
-        <w:spacing w:after="60"/>
+        <w:spacing w:after="40"/>
         <w:ind w:left="360" w:hanging="360"/>
         <w:jc w:val="both"/>
       </w:pPr>
@@ -3471,7 +3475,7 @@
     <w:p>
       <w:bookmarkStart w:id="13" w:name="ref_13"/>
       <w:pPr>
-        <w:spacing w:after="60"/>
+        <w:spacing w:after="40"/>
         <w:ind w:left="360" w:hanging="360"/>
         <w:jc w:val="both"/>
       </w:pPr>
@@ -3541,7 +3545,7 @@
     <w:p>
       <w:bookmarkStart w:id="14" w:name="ref_14"/>
       <w:pPr>
-        <w:spacing w:after="60"/>
+        <w:spacing w:after="40"/>
         <w:ind w:left="360" w:hanging="360"/>
         <w:jc w:val="both"/>
       </w:pPr>
@@ -3611,7 +3615,7 @@
     <w:p>
       <w:bookmarkStart w:id="15" w:name="ref_15"/>
       <w:pPr>
-        <w:spacing w:after="60"/>
+        <w:spacing w:after="40"/>
         <w:ind w:left="360" w:hanging="360"/>
         <w:jc w:val="both"/>
       </w:pPr>
@@ -3681,8 +3685,8 @@
     <w:sectPr>
       <w:type w:val="continuous"/>
       <w:pgSz w:w="12240" w:h="15840"/>
-      <w:pgMar w:top="1080" w:right="900" w:bottom="1440" w:left="900" w:header="720" w:footer="720" w:gutter="0"/>
-      <w:cols w:space="360" w:num="2"/>
+      <w:pgMar w:top="1080" w:right="900" w:bottom="1224" w:left="900" w:header="720" w:footer="720" w:gutter="0"/>
+      <w:cols w:space="280" w:num="2"/>
       <w:docGrid w:linePitch="360"/>
     </w:sectPr>
   </w:body>

</xml_diff>